<commit_message>
Update & Replace isv_software-main
</commit_message>
<xml_diff>
--- a/docs/software/isv_software-main/en/doc/usage_gaussian_en.docx
+++ b/docs/software/isv_software-main/en/doc/usage_gaussian_en.docx
@@ -1,6 +1,6 @@
 
 <file path=word/document.xml><?xml version="1.0" encoding="utf-8"?>
-<w:document xmlns:wpc="http://schemas.microsoft.com/office/word/2010/wordprocessingCanvas" xmlns:cx="http://schemas.microsoft.com/office/drawing/2014/chartex" xmlns:cx1="http://schemas.microsoft.com/office/drawing/2015/9/8/chartex" xmlns:cx2="http://schemas.microsoft.com/office/drawing/2015/10/21/chartex" xmlns:cx3="http://schemas.microsoft.com/office/drawing/2016/5/9/chartex" xmlns:cx4="http://schemas.microsoft.com/office/drawing/2016/5/10/chartex" xmlns:cx5="http://schemas.microsoft.com/office/drawing/2016/5/11/chartex" xmlns:cx6="http://schemas.microsoft.com/office/drawing/2016/5/12/chartex" xmlns:cx7="http://schemas.microsoft.com/office/drawing/2016/5/13/chartex" xmlns:cx8="http://schemas.microsoft.com/office/drawing/2016/5/14/chartex" xmlns:mc="http://schemas.openxmlformats.org/markup-compatibility/2006" xmlns:aink="http://schemas.microsoft.com/office/drawing/2016/ink" xmlns:am3d="http://schemas.microsoft.com/office/drawing/2017/model3d" xmlns:o="urn:schemas-microsoft-com:office:office" xmlns:oel="http://schemas.microsoft.com/office/2019/extlst" xmlns:r="http://schemas.openxmlformats.org/officeDocument/2006/relationships" xmlns:m="http://schemas.openxmlformats.org/officeDocument/2006/math" xmlns:v="urn:schemas-microsoft-com:vml" xmlns:wp14="http://schemas.microsoft.com/office/word/2010/wordprocessingDrawing" xmlns:wp="http://schemas.openxmlformats.org/drawingml/2006/wordprocessingDrawing" xmlns:w10="urn:schemas-microsoft-com:office:word" xmlns:w="http://schemas.openxmlformats.org/wordprocessingml/2006/main" xmlns:w14="http://schemas.microsoft.com/office/word/2010/wordml" xmlns:w15="http://schemas.microsoft.com/office/word/2012/wordml" xmlns:w16cex="http://schemas.microsoft.com/office/word/2018/wordml/cex" xmlns:w16cid="http://schemas.microsoft.com/office/word/2016/wordml/cid" xmlns:w16="http://schemas.microsoft.com/office/word/2018/wordml" xmlns:w16du="http://schemas.microsoft.com/office/word/2023/wordml/word16du" xmlns:w16sdtdh="http://schemas.microsoft.com/office/word/2020/wordml/sdtdatahash" xmlns:w16se="http://schemas.microsoft.com/office/word/2015/wordml/symex" xmlns:wpg="http://schemas.microsoft.com/office/word/2010/wordprocessingGroup" xmlns:wpi="http://schemas.microsoft.com/office/word/2010/wordprocessingInk" xmlns:wne="http://schemas.microsoft.com/office/word/2006/wordml" xmlns:wps="http://schemas.microsoft.com/office/word/2010/wordprocessingShape" mc:Ignorable="w14 w15 w16se w16cid w16 w16cex w16sdtdh w16du wp14">
+<w:document xmlns:wpc="http://schemas.microsoft.com/office/word/2010/wordprocessingCanvas" xmlns:cx="http://schemas.microsoft.com/office/drawing/2014/chartex" xmlns:cx1="http://schemas.microsoft.com/office/drawing/2015/9/8/chartex" xmlns:cx2="http://schemas.microsoft.com/office/drawing/2015/10/21/chartex" xmlns:cx3="http://schemas.microsoft.com/office/drawing/2016/5/9/chartex" xmlns:cx4="http://schemas.microsoft.com/office/drawing/2016/5/10/chartex" xmlns:cx5="http://schemas.microsoft.com/office/drawing/2016/5/11/chartex" xmlns:cx6="http://schemas.microsoft.com/office/drawing/2016/5/12/chartex" xmlns:cx7="http://schemas.microsoft.com/office/drawing/2016/5/13/chartex" xmlns:cx8="http://schemas.microsoft.com/office/drawing/2016/5/14/chartex" xmlns:mc="http://schemas.openxmlformats.org/markup-compatibility/2006" xmlns:aink="http://schemas.microsoft.com/office/drawing/2016/ink" xmlns:am3d="http://schemas.microsoft.com/office/drawing/2017/model3d" xmlns:o="urn:schemas-microsoft-com:office:office" xmlns:oel="http://schemas.microsoft.com/office/2019/extlst" xmlns:r="http://schemas.openxmlformats.org/officeDocument/2006/relationships" xmlns:m="http://schemas.openxmlformats.org/officeDocument/2006/math" xmlns:v="urn:schemas-microsoft-com:vml" xmlns:wp14="http://schemas.microsoft.com/office/word/2010/wordprocessingDrawing" xmlns:wp="http://schemas.openxmlformats.org/drawingml/2006/wordprocessingDrawing" xmlns:w10="urn:schemas-microsoft-com:office:word" xmlns:w="http://schemas.openxmlformats.org/wordprocessingml/2006/main" xmlns:w14="http://schemas.microsoft.com/office/word/2010/wordml" xmlns:w15="http://schemas.microsoft.com/office/word/2012/wordml" xmlns:w16cex="http://schemas.microsoft.com/office/word/2018/wordml/cex" xmlns:w16cid="http://schemas.microsoft.com/office/word/2016/wordml/cid" xmlns:w16="http://schemas.microsoft.com/office/word/2018/wordml" xmlns:w16du="http://schemas.microsoft.com/office/word/2023/wordml/word16du" xmlns:w16sdtdh="http://schemas.microsoft.com/office/word/2020/wordml/sdtdatahash" xmlns:w16sdtfl="http://schemas.microsoft.com/office/word/2024/wordml/sdtformatlock" xmlns:w16se="http://schemas.microsoft.com/office/word/2015/wordml/symex" xmlns:wpg="http://schemas.microsoft.com/office/word/2010/wordprocessingGroup" xmlns:wpi="http://schemas.microsoft.com/office/word/2010/wordprocessingInk" xmlns:wne="http://schemas.microsoft.com/office/word/2006/wordml" xmlns:wps="http://schemas.microsoft.com/office/word/2010/wordprocessingShape" mc:Ignorable="w14 w15 w16se w16cid w16 w16cex w16sdtdh w16sdtfl w16du wp14">
   <w:body>
     <w:p>
       <w:pPr>
@@ -193,7 +193,15 @@
           <w:sz w:val="36"/>
           <w:szCs w:val="36"/>
         </w:rPr>
-        <w:t>October,</w:t>
+        <w:t>March</w:t>
+      </w:r>
+      <w:r>
+        <w:rPr>
+          <w:rFonts w:ascii="HG丸ｺﾞｼｯｸM-PRO" w:hAnsi="HG丸ｺﾞｼｯｸM-PRO" w:hint="eastAsia"/>
+          <w:sz w:val="36"/>
+          <w:szCs w:val="36"/>
+        </w:rPr>
+        <w:t>,</w:t>
       </w:r>
       <w:proofErr w:type="gramEnd"/>
       <w:r>
@@ -202,7 +210,15 @@
           <w:sz w:val="36"/>
           <w:szCs w:val="36"/>
         </w:rPr>
-        <w:t xml:space="preserve"> 2022</w:t>
+        <w:t xml:space="preserve"> 202</w:t>
+      </w:r>
+      <w:r>
+        <w:rPr>
+          <w:rFonts w:ascii="HG丸ｺﾞｼｯｸM-PRO" w:hAnsi="HG丸ｺﾞｼｯｸM-PRO" w:hint="eastAsia"/>
+          <w:sz w:val="36"/>
+          <w:szCs w:val="36"/>
+        </w:rPr>
+        <w:t>6</w:t>
       </w:r>
     </w:p>
     <w:p>
@@ -250,7 +266,6 @@
         <w:tc>
           <w:tcPr>
             <w:tcW w:w="2796" w:type="dxa"/>
-            <w:shd w:val="clear" w:color="auto" w:fill="auto"/>
           </w:tcPr>
           <w:p>
             <w:pPr>
@@ -282,7 +297,6 @@
         <w:tc>
           <w:tcPr>
             <w:tcW w:w="2791" w:type="dxa"/>
-            <w:shd w:val="clear" w:color="auto" w:fill="auto"/>
           </w:tcPr>
           <w:p>
             <w:pPr>
@@ -314,7 +328,6 @@
         <w:tc>
           <w:tcPr>
             <w:tcW w:w="2837" w:type="dxa"/>
-            <w:shd w:val="clear" w:color="auto" w:fill="auto"/>
           </w:tcPr>
           <w:p>
             <w:pPr>
@@ -352,7 +365,6 @@
         <w:tc>
           <w:tcPr>
             <w:tcW w:w="2796" w:type="dxa"/>
-            <w:shd w:val="clear" w:color="auto" w:fill="auto"/>
           </w:tcPr>
           <w:p>
             <w:pPr>
@@ -376,7 +388,6 @@
         <w:tc>
           <w:tcPr>
             <w:tcW w:w="2791" w:type="dxa"/>
-            <w:shd w:val="clear" w:color="auto" w:fill="auto"/>
           </w:tcPr>
           <w:p>
             <w:pPr>
@@ -392,7 +403,6 @@
         <w:tc>
           <w:tcPr>
             <w:tcW w:w="2837" w:type="dxa"/>
-            <w:shd w:val="clear" w:color="auto" w:fill="auto"/>
             <w:vAlign w:val="center"/>
           </w:tcPr>
           <w:p>
@@ -463,6 +473,228 @@
           </w:p>
         </w:tc>
       </w:tr>
+      <w:tr>
+        <w:trPr>
+          <w:trHeight w:val="853"/>
+          <w:jc w:val="center"/>
+        </w:trPr>
+        <w:tc>
+          <w:tcPr>
+            <w:tcW w:w="2796" w:type="dxa"/>
+          </w:tcPr>
+          <w:p>
+            <w:pPr>
+              <w:jc w:val="center"/>
+              <w:rPr>
+                <w:rFonts w:ascii="HG丸ｺﾞｼｯｸM-PRO" w:hAnsi="HG丸ｺﾞｼｯｸM-PRO" w:cs="Meiryo UI"/>
+                <w:sz w:val="28"/>
+                <w:szCs w:val="28"/>
+              </w:rPr>
+            </w:pPr>
+            <w:r>
+              <w:rPr>
+                <w:rFonts w:ascii="HG丸ｺﾞｼｯｸM-PRO" w:hAnsi="HG丸ｺﾞｼｯｸM-PRO" w:cs="Meiryo UI" w:hint="eastAsia"/>
+                <w:sz w:val="28"/>
+                <w:szCs w:val="28"/>
+              </w:rPr>
+              <w:t>1.1</w:t>
+            </w:r>
+          </w:p>
+        </w:tc>
+        <w:tc>
+          <w:tcPr>
+            <w:tcW w:w="2791" w:type="dxa"/>
+          </w:tcPr>
+          <w:p>
+            <w:pPr>
+              <w:spacing w:line="210" w:lineRule="exact"/>
+              <w:jc w:val="center"/>
+              <w:rPr>
+                <w:rFonts w:ascii="HG丸ｺﾞｼｯｸM-PRO" w:hAnsi="HG丸ｺﾞｼｯｸM-PRO" w:cs="Meiryo UI"/>
+                <w:sz w:val="21"/>
+                <w:szCs w:val="21"/>
+              </w:rPr>
+            </w:pPr>
+            <w:r>
+              <w:rPr>
+                <w:rFonts w:ascii="HG丸ｺﾞｼｯｸM-PRO" w:hAnsi="HG丸ｺﾞｼｯｸM-PRO" w:cs="Meiryo UI"/>
+                <w:sz w:val="18"/>
+                <w:szCs w:val="18"/>
+              </w:rPr>
+              <w:t>Added</w:t>
+            </w:r>
+            <w:r>
+              <w:rPr>
+                <w:rFonts w:ascii="HG丸ｺﾞｼｯｸM-PRO" w:hAnsi="HG丸ｺﾞｼｯｸM-PRO" w:cs="Meiryo UI"/>
+                <w:sz w:val="18"/>
+                <w:szCs w:val="18"/>
+              </w:rPr>
+              <w:t xml:space="preserve"> “</w:t>
+            </w:r>
+            <w:r>
+              <w:rPr>
+                <w:rFonts w:ascii="HG丸ｺﾞｼｯｸM-PRO" w:hAnsi="HG丸ｺﾞｼｯｸM-PRO" w:cs="Meiryo UI"/>
+                <w:sz w:val="18"/>
+                <w:szCs w:val="18"/>
+              </w:rPr>
+              <w:t>2</w:t>
+            </w:r>
+            <w:r>
+              <w:rPr>
+                <w:rFonts w:ascii="HG丸ｺﾞｼｯｸM-PRO" w:hAnsi="HG丸ｺﾞｼｯｸM-PRO" w:cs="Meiryo UI"/>
+                <w:sz w:val="18"/>
+                <w:szCs w:val="18"/>
+              </w:rPr>
+              <w:t xml:space="preserve">.３. Settings for execution performance on </w:t>
+            </w:r>
+            <w:proofErr w:type="spellStart"/>
+            <w:r>
+              <w:rPr>
+                <w:rFonts w:ascii="HG丸ｺﾞｼｯｸM-PRO" w:hAnsi="HG丸ｺﾞｼｯｸM-PRO" w:cs="Meiryo UI"/>
+                <w:sz w:val="18"/>
+                <w:szCs w:val="18"/>
+              </w:rPr>
+              <w:t>Fugaku</w:t>
+            </w:r>
+            <w:proofErr w:type="spellEnd"/>
+            <w:r>
+              <w:rPr>
+                <w:rFonts w:ascii="HG丸ｺﾞｼｯｸM-PRO" w:hAnsi="HG丸ｺﾞｼｯｸM-PRO" w:cs="Meiryo UI"/>
+                <w:sz w:val="18"/>
+                <w:szCs w:val="18"/>
+              </w:rPr>
+              <w:t>”</w:t>
+            </w:r>
+          </w:p>
+        </w:tc>
+        <w:tc>
+          <w:tcPr>
+            <w:tcW w:w="2837" w:type="dxa"/>
+            <w:vAlign w:val="center"/>
+          </w:tcPr>
+          <w:p>
+            <w:pPr>
+              <w:jc w:val="center"/>
+              <w:rPr>
+                <w:rFonts w:ascii="HG丸ｺﾞｼｯｸM-PRO" w:hAnsi="HG丸ｺﾞｼｯｸM-PRO" w:cs="Arial"/>
+                <w:sz w:val="28"/>
+                <w:szCs w:val="28"/>
+              </w:rPr>
+            </w:pPr>
+            <w:r>
+              <w:rPr>
+                <w:rFonts w:ascii="HG丸ｺﾞｼｯｸM-PRO" w:hAnsi="HG丸ｺﾞｼｯｸM-PRO" w:cs="Arial" w:hint="eastAsia"/>
+                <w:sz w:val="28"/>
+                <w:szCs w:val="28"/>
+              </w:rPr>
+              <w:t xml:space="preserve">Jun. </w:t>
+            </w:r>
+            <w:r>
+              <w:rPr>
+                <w:rFonts w:ascii="HG丸ｺﾞｼｯｸM-PRO" w:hAnsi="HG丸ｺﾞｼｯｸM-PRO" w:cs="Arial" w:hint="eastAsia"/>
+                <w:sz w:val="28"/>
+                <w:szCs w:val="28"/>
+              </w:rPr>
+              <w:t>3rd, 2024</w:t>
+            </w:r>
+          </w:p>
+        </w:tc>
+      </w:tr>
+      <w:tr>
+        <w:trPr>
+          <w:trHeight w:val="853"/>
+          <w:jc w:val="center"/>
+        </w:trPr>
+        <w:tc>
+          <w:tcPr>
+            <w:tcW w:w="2796" w:type="dxa"/>
+          </w:tcPr>
+          <w:p>
+            <w:pPr>
+              <w:jc w:val="center"/>
+              <w:rPr>
+                <w:rFonts w:ascii="HG丸ｺﾞｼｯｸM-PRO" w:hAnsi="HG丸ｺﾞｼｯｸM-PRO" w:cs="Meiryo UI"/>
+                <w:sz w:val="28"/>
+                <w:szCs w:val="28"/>
+              </w:rPr>
+            </w:pPr>
+            <w:r>
+              <w:rPr>
+                <w:rFonts w:ascii="HG丸ｺﾞｼｯｸM-PRO" w:hAnsi="HG丸ｺﾞｼｯｸM-PRO" w:cs="Meiryo UI" w:hint="eastAsia"/>
+                <w:sz w:val="28"/>
+                <w:szCs w:val="28"/>
+              </w:rPr>
+              <w:t>1.2</w:t>
+            </w:r>
+          </w:p>
+        </w:tc>
+        <w:tc>
+          <w:tcPr>
+            <w:tcW w:w="2791" w:type="dxa"/>
+          </w:tcPr>
+          <w:p>
+            <w:pPr>
+              <w:spacing w:line="210" w:lineRule="exact"/>
+              <w:jc w:val="center"/>
+              <w:rPr>
+                <w:rFonts w:ascii="HG丸ｺﾞｼｯｸM-PRO" w:hAnsi="HG丸ｺﾞｼｯｸM-PRO" w:cs="Meiryo UI"/>
+                <w:sz w:val="28"/>
+                <w:szCs w:val="28"/>
+              </w:rPr>
+            </w:pPr>
+            <w:r>
+              <w:rPr>
+                <w:rFonts w:ascii="HG丸ｺﾞｼｯｸM-PRO" w:hAnsi="HG丸ｺﾞｼｯｸM-PRO" w:cs="Meiryo UI" w:hint="eastAsia"/>
+                <w:sz w:val="18"/>
+                <w:szCs w:val="18"/>
+              </w:rPr>
+              <w:t xml:space="preserve">Added </w:t>
+            </w:r>
+            <w:r>
+              <w:rPr>
+                <w:rFonts w:ascii="HG丸ｺﾞｼｯｸM-PRO" w:hAnsi="HG丸ｺﾞｼｯｸM-PRO" w:cs="Meiryo UI" w:hint="eastAsia"/>
+                <w:sz w:val="18"/>
+                <w:szCs w:val="18"/>
+              </w:rPr>
+              <w:t>Note about sector cache</w:t>
+            </w:r>
+          </w:p>
+        </w:tc>
+        <w:tc>
+          <w:tcPr>
+            <w:tcW w:w="2837" w:type="dxa"/>
+            <w:vAlign w:val="center"/>
+          </w:tcPr>
+          <w:p>
+            <w:pPr>
+              <w:jc w:val="center"/>
+              <w:rPr>
+                <w:rFonts w:ascii="HG丸ｺﾞｼｯｸM-PRO" w:hAnsi="HG丸ｺﾞｼｯｸM-PRO" w:cs="Arial"/>
+                <w:sz w:val="28"/>
+                <w:szCs w:val="28"/>
+              </w:rPr>
+            </w:pPr>
+            <w:proofErr w:type="gramStart"/>
+            <w:r>
+              <w:rPr>
+                <w:rFonts w:ascii="HG丸ｺﾞｼｯｸM-PRO" w:hAnsi="HG丸ｺﾞｼｯｸM-PRO" w:cs="Arial" w:hint="eastAsia"/>
+                <w:sz w:val="28"/>
+                <w:szCs w:val="28"/>
+              </w:rPr>
+              <w:t>Mar,</w:t>
+            </w:r>
+            <w:proofErr w:type="gramEnd"/>
+            <w:r>
+              <w:rPr>
+                <w:rFonts w:ascii="HG丸ｺﾞｼｯｸM-PRO" w:hAnsi="HG丸ｺﾞｼｯｸM-PRO" w:cs="Arial" w:hint="eastAsia"/>
+                <w:sz w:val="28"/>
+                <w:szCs w:val="28"/>
+              </w:rPr>
+              <w:t xml:space="preserve"> 25th, 2026</w:t>
+            </w:r>
+          </w:p>
+        </w:tc>
+      </w:tr>
     </w:tbl>
     <w:p>
       <w:pPr>
@@ -524,7 +756,7 @@
           <w:bCs w:val="0"/>
           <w:noProof/>
           <w:kern w:val="2"/>
-          <w:sz w:val="22"/>
+          <w:sz w:val="21"/>
           <w:szCs w:val="24"/>
           <w14:ligatures w14:val="standardContextual"/>
         </w:rPr>
@@ -547,7 +779,7 @@
         </w:rPr>
         <w:fldChar w:fldCharType="separate"/>
       </w:r>
-      <w:hyperlink w:anchor="_Toc168331352" w:history="1">
+      <w:hyperlink w:anchor="_Toc224117277" w:history="1">
         <w:r>
           <w:rPr>
             <w:rStyle w:val="affffff3"/>
@@ -589,7 +821,7 @@
             <w:noProof/>
             <w:webHidden/>
           </w:rPr>
-          <w:instrText xml:space="preserve"> PAGEREF _Toc168331352 \h </w:instrText>
+          <w:instrText xml:space="preserve"> PAGEREF _Toc224117277 \h </w:instrText>
         </w:r>
         <w:r>
           <w:rPr>
@@ -629,12 +861,12 @@
           <w:bCs w:val="0"/>
           <w:noProof/>
           <w:kern w:val="2"/>
-          <w:sz w:val="22"/>
+          <w:sz w:val="21"/>
           <w:szCs w:val="24"/>
           <w14:ligatures w14:val="standardContextual"/>
         </w:rPr>
       </w:pPr>
-      <w:hyperlink w:anchor="_Toc168331353" w:history="1">
+      <w:hyperlink w:anchor="_Toc224117278" w:history="1">
         <w:r>
           <w:rPr>
             <w:rStyle w:val="affffff3"/>
@@ -687,7 +919,7 @@
             <w:noProof/>
             <w:webHidden/>
           </w:rPr>
-          <w:instrText xml:space="preserve"> PAGEREF _Toc168331353 \h </w:instrText>
+          <w:instrText xml:space="preserve"> PAGEREF _Toc224117278 \h </w:instrText>
         </w:r>
         <w:r>
           <w:rPr>
@@ -728,12 +960,12 @@
           <w:rFonts w:eastAsiaTheme="minorEastAsia" w:cstheme="minorBidi"/>
           <w:noProof/>
           <w:kern w:val="2"/>
-          <w:sz w:val="22"/>
+          <w:sz w:val="21"/>
           <w:szCs w:val="24"/>
           <w14:ligatures w14:val="standardContextual"/>
         </w:rPr>
       </w:pPr>
-      <w:hyperlink w:anchor="_Toc168331354" w:history="1">
+      <w:hyperlink w:anchor="_Toc224117279" w:history="1">
         <w:r>
           <w:rPr>
             <w:rStyle w:val="affffff3"/>
@@ -812,7 +1044,7 @@
             <w:noProof/>
             <w:webHidden/>
           </w:rPr>
-          <w:instrText xml:space="preserve"> PAGEREF _Toc168331354 \h </w:instrText>
+          <w:instrText xml:space="preserve"> PAGEREF _Toc224117279 \h </w:instrText>
         </w:r>
         <w:r>
           <w:rPr>
@@ -853,12 +1085,12 @@
           <w:rFonts w:eastAsiaTheme="minorEastAsia" w:cstheme="minorBidi"/>
           <w:noProof/>
           <w:kern w:val="2"/>
-          <w:sz w:val="22"/>
+          <w:sz w:val="21"/>
           <w:szCs w:val="24"/>
           <w14:ligatures w14:val="standardContextual"/>
         </w:rPr>
       </w:pPr>
-      <w:hyperlink w:anchor="_Toc168331355" w:history="1">
+      <w:hyperlink w:anchor="_Toc224117280" w:history="1">
         <w:r>
           <w:rPr>
             <w:rStyle w:val="affffff3"/>
@@ -937,7 +1169,7 @@
             <w:noProof/>
             <w:webHidden/>
           </w:rPr>
-          <w:instrText xml:space="preserve"> PAGEREF _Toc168331355 \h </w:instrText>
+          <w:instrText xml:space="preserve"> PAGEREF _Toc224117280 \h </w:instrText>
         </w:r>
         <w:r>
           <w:rPr>
@@ -978,12 +1210,12 @@
           <w:rFonts w:eastAsiaTheme="minorEastAsia" w:cstheme="minorBidi"/>
           <w:noProof/>
           <w:kern w:val="2"/>
-          <w:sz w:val="22"/>
+          <w:sz w:val="21"/>
           <w:szCs w:val="24"/>
           <w14:ligatures w14:val="standardContextual"/>
         </w:rPr>
       </w:pPr>
-      <w:hyperlink w:anchor="_Toc168331356" w:history="1">
+      <w:hyperlink w:anchor="_Toc224117281" w:history="1">
         <w:r>
           <w:rPr>
             <w:rStyle w:val="affffff3"/>
@@ -1062,7 +1294,7 @@
             <w:noProof/>
             <w:webHidden/>
           </w:rPr>
-          <w:instrText xml:space="preserve"> PAGEREF _Toc168331356 \h </w:instrText>
+          <w:instrText xml:space="preserve"> PAGEREF _Toc224117281 \h </w:instrText>
         </w:r>
         <w:r>
           <w:rPr>
@@ -1102,12 +1334,12 @@
           <w:bCs w:val="0"/>
           <w:noProof/>
           <w:kern w:val="2"/>
-          <w:sz w:val="22"/>
+          <w:sz w:val="21"/>
           <w:szCs w:val="24"/>
           <w14:ligatures w14:val="standardContextual"/>
         </w:rPr>
       </w:pPr>
-      <w:hyperlink w:anchor="_Toc168331357" w:history="1">
+      <w:hyperlink w:anchor="_Toc224117282" w:history="1">
         <w:r>
           <w:rPr>
             <w:rStyle w:val="affffff3"/>
@@ -1160,7 +1392,7 @@
             <w:noProof/>
             <w:webHidden/>
           </w:rPr>
-          <w:instrText xml:space="preserve"> PAGEREF _Toc168331357 \h </w:instrText>
+          <w:instrText xml:space="preserve"> PAGEREF _Toc224117282 \h </w:instrText>
         </w:r>
         <w:r>
           <w:rPr>
@@ -1201,12 +1433,12 @@
           <w:rFonts w:eastAsiaTheme="minorEastAsia" w:cstheme="minorBidi"/>
           <w:noProof/>
           <w:kern w:val="2"/>
-          <w:sz w:val="22"/>
+          <w:sz w:val="21"/>
           <w:szCs w:val="24"/>
           <w14:ligatures w14:val="standardContextual"/>
         </w:rPr>
       </w:pPr>
-      <w:hyperlink w:anchor="_Toc168331358" w:history="1">
+      <w:hyperlink w:anchor="_Toc224117283" w:history="1">
         <w:r>
           <w:rPr>
             <w:rStyle w:val="affffff3"/>
@@ -1285,7 +1517,7 @@
             <w:noProof/>
             <w:webHidden/>
           </w:rPr>
-          <w:instrText xml:space="preserve"> PAGEREF _Toc168331358 \h </w:instrText>
+          <w:instrText xml:space="preserve"> PAGEREF _Toc224117283 \h </w:instrText>
         </w:r>
         <w:r>
           <w:rPr>
@@ -1325,12 +1557,12 @@
           <w:bCs w:val="0"/>
           <w:noProof/>
           <w:kern w:val="2"/>
-          <w:sz w:val="22"/>
+          <w:sz w:val="21"/>
           <w:szCs w:val="24"/>
           <w14:ligatures w14:val="standardContextual"/>
         </w:rPr>
       </w:pPr>
-      <w:hyperlink w:anchor="_Toc168331359" w:history="1">
+      <w:hyperlink w:anchor="_Toc224117284" w:history="1">
         <w:r>
           <w:rPr>
             <w:rStyle w:val="affffff3"/>
@@ -1383,7 +1615,7 @@
             <w:noProof/>
             <w:webHidden/>
           </w:rPr>
-          <w:instrText xml:space="preserve"> PAGEREF _Toc168331359 \h </w:instrText>
+          <w:instrText xml:space="preserve"> PAGEREF _Toc224117284 \h </w:instrText>
         </w:r>
         <w:r>
           <w:rPr>
@@ -1423,12 +1655,12 @@
           <w:bCs w:val="0"/>
           <w:noProof/>
           <w:kern w:val="2"/>
-          <w:sz w:val="22"/>
+          <w:sz w:val="21"/>
           <w:szCs w:val="24"/>
           <w14:ligatures w14:val="standardContextual"/>
         </w:rPr>
       </w:pPr>
-      <w:hyperlink w:anchor="_Toc168331360" w:history="1">
+      <w:hyperlink w:anchor="_Toc224117285" w:history="1">
         <w:r>
           <w:rPr>
             <w:rStyle w:val="affffff3"/>
@@ -1481,7 +1713,7 @@
             <w:noProof/>
             <w:webHidden/>
           </w:rPr>
-          <w:instrText xml:space="preserve"> PAGEREF _Toc168331360 \h </w:instrText>
+          <w:instrText xml:space="preserve"> PAGEREF _Toc224117285 \h </w:instrText>
         </w:r>
         <w:r>
           <w:rPr>
@@ -1501,7 +1733,7 @@
             <w:noProof/>
             <w:webHidden/>
           </w:rPr>
-          <w:t>5</w:t>
+          <w:t>6</w:t>
         </w:r>
         <w:r>
           <w:rPr>
@@ -1522,12 +1754,12 @@
           <w:rFonts w:eastAsiaTheme="minorEastAsia" w:cstheme="minorBidi"/>
           <w:noProof/>
           <w:kern w:val="2"/>
-          <w:sz w:val="22"/>
+          <w:sz w:val="21"/>
           <w:szCs w:val="24"/>
           <w14:ligatures w14:val="standardContextual"/>
         </w:rPr>
       </w:pPr>
-      <w:hyperlink w:anchor="_Toc168331361" w:history="1">
+      <w:hyperlink w:anchor="_Toc224117286" w:history="1">
         <w:r>
           <w:rPr>
             <w:rStyle w:val="affffff3"/>
@@ -1606,7 +1838,7 @@
             <w:noProof/>
             <w:webHidden/>
           </w:rPr>
-          <w:instrText xml:space="preserve"> PAGEREF _Toc168331361 \h </w:instrText>
+          <w:instrText xml:space="preserve"> PAGEREF _Toc224117286 \h </w:instrText>
         </w:r>
         <w:r>
           <w:rPr>
@@ -1682,25 +1914,16 @@
     </w:p>
     <w:p>
       <w:pPr>
-        <w:overflowPunct/>
-        <w:topLinePunct w:val="0"/>
-        <w:adjustRightInd/>
-        <w:spacing w:line="240" w:lineRule="auto"/>
-        <w:jc w:val="left"/>
-        <w:textAlignment w:val="auto"/>
+        <w:pStyle w:val="11"/>
         <w:rPr>
           <w:rFonts w:ascii="HG丸ｺﾞｼｯｸM-PRO" w:hAnsi="HG丸ｺﾞｼｯｸM-PRO"/>
         </w:rPr>
       </w:pPr>
-    </w:p>
-    <w:p>
-      <w:pPr>
-        <w:pStyle w:val="11"/>
-        <w:rPr>
-          <w:rFonts w:ascii="HG丸ｺﾞｼｯｸM-PRO" w:hAnsi="HG丸ｺﾞｼｯｸM-PRO"/>
-        </w:rPr>
-      </w:pPr>
-      <w:bookmarkStart w:id="4" w:name="_Toc168331352"/>
+      <w:bookmarkStart w:id="4" w:name="_Toc224117095"/>
+      <w:bookmarkStart w:id="5" w:name="_Toc224117276"/>
+      <w:bookmarkStart w:id="6" w:name="_Toc224117277"/>
+      <w:bookmarkEnd w:id="4"/>
+      <w:bookmarkEnd w:id="5"/>
       <w:bookmarkEnd w:id="1"/>
       <w:bookmarkEnd w:id="2"/>
       <w:bookmarkEnd w:id="3"/>
@@ -1708,16 +1931,17 @@
         <w:rPr>
           <w:rFonts w:ascii="HG丸ｺﾞｼｯｸM-PRO" w:hAnsi="HG丸ｺﾞｼｯｸM-PRO"/>
         </w:rPr>
+        <w:lastRenderedPageBreak/>
         <w:t>Preface</w:t>
       </w:r>
-      <w:bookmarkEnd w:id="4"/>
+      <w:bookmarkEnd w:id="6"/>
     </w:p>
     <w:p>
       <w:pPr>
         <w:pStyle w:val="a6"/>
         <w:ind w:firstLineChars="0" w:firstLine="0"/>
         <w:rPr>
-          <w:rFonts w:asciiTheme="minorEastAsia" w:eastAsiaTheme="minorEastAsia" w:hAnsiTheme="minorEastAsia"/>
+          <w:rFonts w:asciiTheme="minorHAnsi" w:eastAsiaTheme="minorEastAsia" w:hAnsiTheme="minorHAnsi"/>
           <w:b/>
           <w:bCs/>
           <w:sz w:val="22"/>
@@ -1726,23 +1950,13 @@
       </w:pPr>
       <w:r>
         <w:rPr>
-          <w:rFonts w:asciiTheme="minorEastAsia" w:eastAsiaTheme="minorEastAsia" w:hAnsiTheme="minorEastAsia"/>
+          <w:rFonts w:asciiTheme="minorHAnsi" w:eastAsiaTheme="minorEastAsia" w:hAnsiTheme="minorHAnsi"/>
           <w:b/>
           <w:bCs/>
           <w:sz w:val="22"/>
           <w:szCs w:val="22"/>
         </w:rPr>
-        <w:t xml:space="preserve">Purpose of This </w:t>
-      </w:r>
-      <w:r>
-        <w:rPr>
-          <w:rFonts w:asciiTheme="minorEastAsia" w:eastAsiaTheme="minorEastAsia" w:hAnsiTheme="minorEastAsia"/>
-          <w:b/>
-          <w:bCs/>
-          <w:sz w:val="22"/>
-          <w:szCs w:val="22"/>
-        </w:rPr>
-        <w:t>Document</w:t>
+        <w:t>Purpose of This Document</w:t>
       </w:r>
     </w:p>
     <w:p>
@@ -2199,13 +2413,13 @@
       <w:pPr>
         <w:pStyle w:val="11"/>
       </w:pPr>
-      <w:bookmarkStart w:id="5" w:name="_Toc112934663"/>
-      <w:bookmarkStart w:id="6" w:name="_ユーザーライセンスの設定"/>
-      <w:bookmarkStart w:id="7" w:name="_Toc112934666"/>
-      <w:bookmarkStart w:id="8" w:name="_Toc168331353"/>
-      <w:bookmarkEnd w:id="5"/>
-      <w:bookmarkEnd w:id="6"/>
+      <w:bookmarkStart w:id="7" w:name="_Toc112934663"/>
+      <w:bookmarkStart w:id="8" w:name="_ユーザーライセンスの設定"/>
+      <w:bookmarkStart w:id="9" w:name="_Toc112934666"/>
+      <w:bookmarkStart w:id="10" w:name="_Toc224117278"/>
       <w:bookmarkEnd w:id="7"/>
+      <w:bookmarkEnd w:id="8"/>
+      <w:bookmarkEnd w:id="9"/>
       <w:r>
         <w:lastRenderedPageBreak/>
         <w:t xml:space="preserve">Executing </w:t>
@@ -2216,7 +2430,7 @@
         </w:rPr>
         <w:t>Gaussian</w:t>
       </w:r>
-      <w:bookmarkEnd w:id="8"/>
+      <w:bookmarkEnd w:id="10"/>
     </w:p>
     <w:p>
       <w:pPr>
@@ -2335,19 +2549,11 @@
                 <w:rFonts w:asciiTheme="minorHAnsi" w:eastAsiaTheme="minorEastAsia" w:hAnsiTheme="minorHAnsi"/>
               </w:rPr>
             </w:pPr>
-            <w:proofErr w:type="gramStart"/>
             <w:r>
               <w:rPr>
                 <w:rFonts w:asciiTheme="minorHAnsi" w:eastAsiaTheme="minorEastAsia" w:hAnsiTheme="minorHAnsi"/>
               </w:rPr>
-              <w:t>#!/</w:t>
-            </w:r>
-            <w:proofErr w:type="gramEnd"/>
-            <w:r>
-              <w:rPr>
-                <w:rFonts w:asciiTheme="minorHAnsi" w:eastAsiaTheme="minorEastAsia" w:hAnsiTheme="minorHAnsi"/>
-              </w:rPr>
-              <w:t>bin/bash</w:t>
+              <w:t>#!/bin/bash</w:t>
             </w:r>
           </w:p>
           <w:p>
@@ -2423,23 +2629,7 @@
                 <w:rFonts w:asciiTheme="minorHAnsi" w:eastAsiaTheme="minorEastAsia" w:hAnsiTheme="minorHAnsi"/>
                 <w:color w:val="FF0000"/>
               </w:rPr>
-              <w:t>=</w:t>
-            </w:r>
-            <w:proofErr w:type="gramStart"/>
-            <w:r>
-              <w:rPr>
-                <w:rFonts w:asciiTheme="minorHAnsi" w:eastAsiaTheme="minorEastAsia" w:hAnsiTheme="minorHAnsi"/>
-                <w:color w:val="FF0000"/>
-              </w:rPr>
-              <w:t>2200,eco</w:t>
-            </w:r>
-            <w:proofErr w:type="gramEnd"/>
-            <w:r>
-              <w:rPr>
-                <w:rFonts w:asciiTheme="minorHAnsi" w:eastAsiaTheme="minorEastAsia" w:hAnsiTheme="minorHAnsi"/>
-                <w:color w:val="FF0000"/>
-              </w:rPr>
-              <w:t>_state=2"</w:t>
+              <w:t>=2200,eco_state=2"</w:t>
             </w:r>
           </w:p>
           <w:p>
@@ -2743,7 +2933,7 @@
       <w:pPr>
         <w:pStyle w:val="20"/>
       </w:pPr>
-      <w:bookmarkStart w:id="9" w:name="_Toc168331354"/>
+      <w:bookmarkStart w:id="11" w:name="_Toc224117279"/>
       <w:r>
         <w:rPr>
           <w:rFonts w:hint="eastAsia"/>
@@ -2753,7 +2943,7 @@
       <w:r>
         <w:t>ettings in Input File</w:t>
       </w:r>
-      <w:bookmarkEnd w:id="9"/>
+      <w:bookmarkEnd w:id="11"/>
     </w:p>
     <w:p>
       <w:pPr>
@@ -2940,7 +3130,7 @@
                 <w:rFonts w:asciiTheme="minorHAnsi" w:hAnsiTheme="minorHAnsi"/>
               </w:rPr>
             </w:pPr>
-            <w:bookmarkStart w:id="10" w:name="_Hlk113613868"/>
+            <w:bookmarkStart w:id="12" w:name="_Hlk113613868"/>
             <w:r>
               <w:rPr>
                 <w:rFonts w:asciiTheme="minorHAnsi" w:eastAsiaTheme="minorEastAsia" w:hAnsiTheme="minorHAnsi" w:hint="eastAsia"/>
@@ -2952,7 +3142,7 @@
           </w:p>
         </w:tc>
       </w:tr>
-      <w:bookmarkEnd w:id="10"/>
+      <w:bookmarkEnd w:id="12"/>
     </w:tbl>
     <w:p>
       <w:pPr>
@@ -3177,14 +3367,30 @@
                 <w:rFonts w:ascii="Century" w:eastAsiaTheme="minorEastAsia" w:hAnsi="Century"/>
                 <w:sz w:val="22"/>
               </w:rPr>
-              <w:t xml:space="preserve">.g.: </w:t>
+              <w:t>.g</w:t>
+            </w:r>
+            <w:proofErr w:type="gramStart"/>
+            <w:r>
+              <w:rPr>
+                <w:rFonts w:ascii="Century" w:eastAsiaTheme="minorEastAsia" w:hAnsi="Century"/>
+                <w:sz w:val="22"/>
+              </w:rPr>
+              <w:t xml:space="preserve">.: </w:t>
             </w:r>
             <w:r>
               <w:rPr>
                 <w:rFonts w:ascii="Century" w:eastAsiaTheme="minorEastAsia" w:hAnsi="Century"/>
                 <w:sz w:val="22"/>
               </w:rPr>
-              <w:t xml:space="preserve"># </w:t>
+              <w:t>#</w:t>
+            </w:r>
+            <w:proofErr w:type="gramEnd"/>
+            <w:r>
+              <w:rPr>
+                <w:rFonts w:ascii="Century" w:eastAsiaTheme="minorEastAsia" w:hAnsi="Century"/>
+                <w:sz w:val="22"/>
+              </w:rPr>
+              <w:t xml:space="preserve"> </w:t>
             </w:r>
             <w:proofErr w:type="spellStart"/>
             <w:r>
@@ -3200,7 +3406,15 @@
                 <w:rFonts w:ascii="Century" w:eastAsiaTheme="minorEastAsia" w:hAnsi="Century"/>
                 <w:sz w:val="22"/>
               </w:rPr>
-              <w:t xml:space="preserve">/sto-3g </w:t>
+              <w:t>/sto-3</w:t>
+            </w:r>
+            <w:proofErr w:type="gramStart"/>
+            <w:r>
+              <w:rPr>
+                <w:rFonts w:ascii="Century" w:eastAsiaTheme="minorEastAsia" w:hAnsi="Century"/>
+                <w:sz w:val="22"/>
+              </w:rPr>
+              <w:t xml:space="preserve">g </w:t>
             </w:r>
             <w:r>
               <w:rPr>
@@ -3214,7 +3428,15 @@
                 <w:rFonts w:ascii="Century" w:eastAsiaTheme="minorEastAsia" w:hAnsi="Century"/>
                 <w:sz w:val="22"/>
               </w:rPr>
-              <w:t xml:space="preserve"> #p </w:t>
+              <w:t xml:space="preserve"> #p</w:t>
+            </w:r>
+            <w:proofErr w:type="gramEnd"/>
+            <w:r>
+              <w:rPr>
+                <w:rFonts w:ascii="Century" w:eastAsiaTheme="minorEastAsia" w:hAnsi="Century"/>
+                <w:sz w:val="22"/>
+              </w:rPr>
+              <w:t xml:space="preserve"> </w:t>
             </w:r>
             <w:proofErr w:type="spellStart"/>
             <w:r>
@@ -3246,7 +3468,7 @@
       <w:pPr>
         <w:pStyle w:val="20"/>
       </w:pPr>
-      <w:bookmarkStart w:id="11" w:name="_Toc168331355"/>
+      <w:bookmarkStart w:id="13" w:name="_Toc224117280"/>
       <w:r>
         <w:lastRenderedPageBreak/>
         <w:t xml:space="preserve">Settings for </w:t>
@@ -3260,7 +3482,7 @@
       <w:r>
         <w:t xml:space="preserve"> in Job Script</w:t>
       </w:r>
-      <w:bookmarkEnd w:id="11"/>
+      <w:bookmarkEnd w:id="13"/>
     </w:p>
     <w:p>
       <w:pPr>
@@ -3300,25 +3522,7 @@
           <w:sz w:val="22"/>
           <w:szCs w:val="22"/>
         </w:rPr>
-        <w:t>=</w:t>
-      </w:r>
-      <w:proofErr w:type="gramStart"/>
-      <w:r>
-        <w:rPr>
-          <w:rFonts w:asciiTheme="minorHAnsi" w:eastAsiaTheme="minorEastAsia" w:hAnsiTheme="minorHAnsi"/>
-          <w:sz w:val="22"/>
-          <w:szCs w:val="22"/>
-        </w:rPr>
-        <w:t>2200,eco</w:t>
-      </w:r>
-      <w:proofErr w:type="gramEnd"/>
-      <w:r>
-        <w:rPr>
-          <w:rFonts w:asciiTheme="minorHAnsi" w:eastAsiaTheme="minorEastAsia" w:hAnsiTheme="minorHAnsi"/>
-          <w:sz w:val="22"/>
-          <w:szCs w:val="22"/>
-        </w:rPr>
-        <w:t>_state=2"</w:t>
+        <w:t>=2200,eco_state=2"</w:t>
       </w:r>
     </w:p>
     <w:p>
@@ -3469,7 +3673,25 @@
           <w:sz w:val="22"/>
           <w:szCs w:val="22"/>
         </w:rPr>
-        <w:t>or more detail, please refer to:</w:t>
+        <w:t xml:space="preserve">or more </w:t>
+      </w:r>
+      <w:proofErr w:type="gramStart"/>
+      <w:r>
+        <w:rPr>
+          <w:rFonts w:asciiTheme="minorHAnsi" w:eastAsiaTheme="minorEastAsia" w:hAnsiTheme="minorHAnsi"/>
+          <w:sz w:val="22"/>
+          <w:szCs w:val="22"/>
+        </w:rPr>
+        <w:t>detail</w:t>
+      </w:r>
+      <w:proofErr w:type="gramEnd"/>
+      <w:r>
+        <w:rPr>
+          <w:rFonts w:asciiTheme="minorHAnsi" w:eastAsiaTheme="minorEastAsia" w:hAnsiTheme="minorHAnsi"/>
+          <w:sz w:val="22"/>
+          <w:szCs w:val="22"/>
+        </w:rPr>
+        <w:t>, please refer to:</w:t>
       </w:r>
     </w:p>
     <w:p>
@@ -3882,7 +4104,7 @@
                 <w:rFonts w:asciiTheme="minorHAnsi" w:hAnsiTheme="minorHAnsi"/>
               </w:rPr>
             </w:pPr>
-            <w:bookmarkStart w:id="12" w:name="_Hlk113613670"/>
+            <w:bookmarkStart w:id="14" w:name="_Hlk113613670"/>
             <w:r>
               <w:rPr>
                 <w:rFonts w:asciiTheme="minorHAnsi" w:eastAsiaTheme="minorEastAsia" w:hAnsiTheme="minorHAnsi"/>
@@ -3911,7 +4133,7 @@
         </w:tc>
       </w:tr>
     </w:tbl>
-    <w:bookmarkEnd w:id="12"/>
+    <w:bookmarkEnd w:id="14"/>
     <w:p>
       <w:pPr>
         <w:pStyle w:val="a6"/>
@@ -4055,6 +4277,24 @@
           <w:szCs w:val="22"/>
         </w:rPr>
         <w:t>.</w:t>
+      </w:r>
+      <w:r>
+        <w:rPr>
+          <w:rFonts w:asciiTheme="minorHAnsi" w:eastAsiaTheme="minorEastAsia" w:hAnsiTheme="minorHAnsi"/>
+          <w:color w:val="FF0000"/>
+          <w:sz w:val="22"/>
+          <w:szCs w:val="22"/>
+        </w:rPr>
+        <w:br/>
+      </w:r>
+      <w:r>
+        <w:rPr>
+          <w:rFonts w:asciiTheme="minorHAnsi" w:eastAsiaTheme="minorEastAsia" w:hAnsiTheme="minorHAnsi"/>
+          <w:color w:val="FF0000"/>
+          <w:sz w:val="22"/>
+          <w:szCs w:val="22"/>
+        </w:rPr>
+        <w:t>Gaussian does not meet the requirements for using the sector cache, so the environment variable FLIB_SCCR_CNTL is set to FALSE. If you run any process that requires the sector cache after Gaussian, set the environment variable FLIB_SCCR_CNTL to TRUE beforehand.</w:t>
       </w:r>
     </w:p>
     <w:p>
@@ -4712,7 +4952,7 @@
       <w:pPr>
         <w:pStyle w:val="20"/>
       </w:pPr>
-      <w:bookmarkStart w:id="13" w:name="_Toc168331356"/>
+      <w:bookmarkStart w:id="15" w:name="_Toc224117281"/>
       <w:r>
         <w:t xml:space="preserve">Settings for execution performance on </w:t>
       </w:r>
@@ -4720,7 +4960,7 @@
       <w:r>
         <w:t>Fugaku</w:t>
       </w:r>
-      <w:bookmarkEnd w:id="13"/>
+      <w:bookmarkEnd w:id="15"/>
       <w:proofErr w:type="spellEnd"/>
     </w:p>
     <w:p>
@@ -4815,23 +5055,13 @@
               <w:t>export XOS_MMM_L_PAGING_POLICY=</w:t>
             </w:r>
             <w:proofErr w:type="spellStart"/>
-            <w:proofErr w:type="gramStart"/>
             <w:r>
               <w:rPr>
                 <w:rFonts w:asciiTheme="minorHAnsi" w:eastAsiaTheme="minorEastAsia" w:hAnsiTheme="minorHAnsi"/>
                 <w:sz w:val="22"/>
                 <w:szCs w:val="22"/>
               </w:rPr>
-              <w:t>demand:demand</w:t>
-            </w:r>
-            <w:proofErr w:type="gramEnd"/>
-            <w:r>
-              <w:rPr>
-                <w:rFonts w:asciiTheme="minorHAnsi" w:eastAsiaTheme="minorEastAsia" w:hAnsiTheme="minorHAnsi"/>
-                <w:sz w:val="22"/>
-                <w:szCs w:val="22"/>
-              </w:rPr>
-              <w:t>:demand</w:t>
+              <w:t>demand:demand:demand</w:t>
             </w:r>
             <w:proofErr w:type="spellEnd"/>
           </w:p>
@@ -4855,7 +5085,6 @@
           <w:color w:val="1D1C1D"/>
           <w:sz w:val="21"/>
           <w:szCs w:val="21"/>
-          <w:shd w:val="clear" w:color="auto" w:fill="F8F8F8"/>
         </w:rPr>
         <w:t xml:space="preserve">For more information about the paging method, see </w:t>
       </w:r>
@@ -4866,7 +5095,6 @@
             <w:rFonts w:asciiTheme="minorHAnsi" w:hAnsiTheme="minorHAnsi" w:cs="Arial"/>
             <w:sz w:val="21"/>
             <w:szCs w:val="21"/>
-            <w:shd w:val="clear" w:color="auto" w:fill="F8F8F8"/>
           </w:rPr>
           <w:t>Users Guide</w:t>
         </w:r>
@@ -4877,7 +5105,6 @@
           <w:color w:val="1D1C1D"/>
           <w:sz w:val="21"/>
           <w:szCs w:val="21"/>
-          <w:shd w:val="clear" w:color="auto" w:fill="F8F8F8"/>
         </w:rPr>
         <w:t xml:space="preserve"> and </w:t>
       </w:r>
@@ -4888,7 +5115,6 @@
             <w:rFonts w:asciiTheme="minorHAnsi" w:hAnsiTheme="minorHAnsi" w:cs="Arial"/>
             <w:sz w:val="21"/>
             <w:szCs w:val="21"/>
-            <w:shd w:val="clear" w:color="auto" w:fill="F8F8F8"/>
           </w:rPr>
           <w:t>Programming Guide</w:t>
         </w:r>
@@ -4907,7 +5133,6 @@
             <w:rFonts w:asciiTheme="minorHAnsi" w:hAnsiTheme="minorHAnsi" w:cs="Arial"/>
             <w:sz w:val="21"/>
             <w:szCs w:val="21"/>
-            <w:shd w:val="clear" w:color="auto" w:fill="F8F8F8"/>
           </w:rPr>
           <w:t>(Programming common</w:t>
         </w:r>
@@ -4926,7 +5151,6 @@
             <w:rFonts w:asciiTheme="minorHAnsi" w:hAnsiTheme="minorHAnsi" w:cs="Arial"/>
             <w:sz w:val="21"/>
             <w:szCs w:val="21"/>
-            <w:shd w:val="clear" w:color="auto" w:fill="F8F8F8"/>
           </w:rPr>
           <w:t>part)</w:t>
         </w:r>
@@ -4937,7 +5161,6 @@
           <w:color w:val="1D1C1D"/>
           <w:sz w:val="21"/>
           <w:szCs w:val="21"/>
-          <w:shd w:val="clear" w:color="auto" w:fill="F8F8F8"/>
         </w:rPr>
         <w:t>.</w:t>
       </w:r>
@@ -4946,25 +5169,25 @@
       <w:pPr>
         <w:pStyle w:val="11"/>
       </w:pPr>
-      <w:bookmarkStart w:id="14" w:name="_Toc113958368"/>
-      <w:bookmarkStart w:id="15" w:name="_Toc113958369"/>
-      <w:bookmarkStart w:id="16" w:name="_Toc113958370"/>
-      <w:bookmarkStart w:id="17" w:name="_Toc113958371"/>
-      <w:bookmarkStart w:id="18" w:name="_Toc98164629"/>
-      <w:bookmarkStart w:id="19" w:name="_Toc168331357"/>
-      <w:bookmarkEnd w:id="14"/>
-      <w:bookmarkEnd w:id="15"/>
+      <w:bookmarkStart w:id="16" w:name="_Toc113958368"/>
+      <w:bookmarkStart w:id="17" w:name="_Toc113958369"/>
+      <w:bookmarkStart w:id="18" w:name="_Toc113958370"/>
+      <w:bookmarkStart w:id="19" w:name="_Toc113958371"/>
+      <w:bookmarkStart w:id="20" w:name="_Toc98164629"/>
+      <w:bookmarkStart w:id="21" w:name="_Toc224117282"/>
       <w:bookmarkEnd w:id="16"/>
       <w:bookmarkEnd w:id="17"/>
-      <w:r>
-        <w:t xml:space="preserve">Using </w:t>
-      </w:r>
-      <w:proofErr w:type="spellStart"/>
-      <w:r>
-        <w:t>GaussView</w:t>
-      </w:r>
       <w:bookmarkEnd w:id="18"/>
       <w:bookmarkEnd w:id="19"/>
+      <w:r>
+        <w:t xml:space="preserve">Using </w:t>
+      </w:r>
+      <w:proofErr w:type="spellStart"/>
+      <w:r>
+        <w:t>GaussView</w:t>
+      </w:r>
+      <w:bookmarkEnd w:id="20"/>
+      <w:bookmarkEnd w:id="21"/>
       <w:proofErr w:type="spellEnd"/>
     </w:p>
     <w:p>
@@ -5125,24 +5348,13 @@
             </w:r>
             <w:proofErr w:type="spellEnd"/>
             <w:r>
-              <w:t>]</w:t>
-            </w:r>
-            <w:proofErr w:type="gramStart"/>
-            <w:r>
-              <w:t xml:space="preserve">$  </w:t>
+              <w:t xml:space="preserve">]$  </w:t>
             </w:r>
             <w:r>
               <w:rPr>
                 <w:color w:val="FF0000"/>
               </w:rPr>
-              <w:t>module</w:t>
-            </w:r>
-            <w:proofErr w:type="gramEnd"/>
-            <w:r>
-              <w:rPr>
-                <w:color w:val="FF0000"/>
-              </w:rPr>
-              <w:t xml:space="preserve"> use /vol0004/apps/</w:t>
+              <w:t>module use /vol0004/apps/</w:t>
             </w:r>
             <w:proofErr w:type="spellStart"/>
             <w:r>
@@ -5197,24 +5409,13 @@
             </w:r>
             <w:proofErr w:type="spellEnd"/>
             <w:r>
-              <w:t>]</w:t>
-            </w:r>
-            <w:proofErr w:type="gramStart"/>
-            <w:r>
-              <w:t xml:space="preserve">$  </w:t>
+              <w:t xml:space="preserve">]$  </w:t>
             </w:r>
             <w:r>
               <w:rPr>
                 <w:color w:val="FF0000"/>
               </w:rPr>
-              <w:t>module</w:t>
-            </w:r>
-            <w:proofErr w:type="gramEnd"/>
-            <w:r>
-              <w:rPr>
-                <w:color w:val="FF0000"/>
-              </w:rPr>
-              <w:t xml:space="preserve"> </w:t>
+              <w:t xml:space="preserve">module </w:t>
             </w:r>
             <w:r>
               <w:rPr>
@@ -5245,15 +5446,7 @@
             </w:r>
             <w:proofErr w:type="spellEnd"/>
             <w:r>
-              <w:t>]</w:t>
-            </w:r>
-            <w:proofErr w:type="gramStart"/>
-            <w:r>
-              <w:t>$ .</w:t>
-            </w:r>
-            <w:proofErr w:type="gramEnd"/>
-            <w:r>
-              <w:t xml:space="preserve"> $g16root/g16/</w:t>
+              <w:t>]$ . $g16root/g16/</w:t>
             </w:r>
             <w:proofErr w:type="spellStart"/>
             <w:r>
@@ -5422,15 +5615,7 @@
         <w:t>A</w:t>
       </w:r>
       <w:r>
-        <w:t xml:space="preserve">fter this setting </w:t>
-      </w:r>
-      <w:proofErr w:type="gramStart"/>
-      <w:r>
-        <w:t>applied ,</w:t>
-      </w:r>
-      <w:proofErr w:type="gramEnd"/>
-      <w:r>
-        <w:t xml:space="preserve"> execute </w:t>
+        <w:t xml:space="preserve">fter this setting applied , execute </w:t>
       </w:r>
       <w:proofErr w:type="spellStart"/>
       <w:r>
@@ -5443,10 +5628,14 @@
     </w:p>
     <w:p>
       <w:pPr>
+        <w:pStyle w:val="afffffff9"/>
+        <w:ind w:firstLine="220"/>
+      </w:pPr>
+    </w:p>
+    <w:p>
+      <w:pPr>
         <w:pStyle w:val="20"/>
-        <w:ind w:firstLine="1"/>
-      </w:pPr>
-      <w:bookmarkStart w:id="20" w:name="_Toc168331358"/>
+      </w:pPr>
       <w:r>
         <w:t xml:space="preserve">Settings for </w:t>
       </w:r>
@@ -5460,7 +5649,6 @@
       <w:r>
         <w:t>aussView</w:t>
       </w:r>
-      <w:bookmarkEnd w:id="20"/>
       <w:proofErr w:type="spellEnd"/>
     </w:p>
     <w:p>
@@ -5803,6 +5991,7 @@
               <w:rPr>
                 <w:rFonts w:asciiTheme="minorHAnsi" w:eastAsiaTheme="minorEastAsia" w:hAnsiTheme="minorHAnsi"/>
               </w:rPr>
+              <w:lastRenderedPageBreak/>
               <w:t>module load</w:t>
             </w:r>
             <w:r>
@@ -5897,7 +6086,6 @@
           <w:sz w:val="22"/>
           <w:szCs w:val="22"/>
         </w:rPr>
-        <w:lastRenderedPageBreak/>
         <w:t>N</w:t>
       </w:r>
       <w:r>
@@ -6649,7 +6837,7 @@
       <w:pPr>
         <w:pStyle w:val="11"/>
       </w:pPr>
-      <w:bookmarkStart w:id="21" w:name="_Toc168331359"/>
+      <w:bookmarkStart w:id="22" w:name="_Toc224117284"/>
       <w:r>
         <w:t xml:space="preserve">Change of </w:t>
       </w:r>
@@ -6665,7 +6853,7 @@
       <w:r>
         <w:t>Environment</w:t>
       </w:r>
-      <w:bookmarkEnd w:id="21"/>
+      <w:bookmarkEnd w:id="22"/>
     </w:p>
     <w:p>
       <w:pPr>
@@ -6699,6 +6887,7 @@
         </w:rPr>
         <w:t xml:space="preserve">posted </w:t>
       </w:r>
+      <w:proofErr w:type="gramStart"/>
       <w:r>
         <w:rPr>
           <w:rFonts w:hint="eastAsia"/>
@@ -6710,7 +6899,14 @@
         <w:rPr>
           <w:szCs w:val="22"/>
         </w:rPr>
-        <w:t xml:space="preserve">n the </w:t>
+        <w:t>n</w:t>
+      </w:r>
+      <w:proofErr w:type="gramEnd"/>
+      <w:r>
+        <w:rPr>
+          <w:szCs w:val="22"/>
+        </w:rPr>
+        <w:t xml:space="preserve"> the </w:t>
       </w:r>
       <w:proofErr w:type="spellStart"/>
       <w:r>
@@ -7145,19 +7341,42 @@
     </w:p>
     <w:p>
       <w:pPr>
+        <w:overflowPunct/>
+        <w:topLinePunct w:val="0"/>
+        <w:adjustRightInd/>
+        <w:spacing w:line="240" w:lineRule="auto"/>
+        <w:jc w:val="left"/>
+        <w:textAlignment w:val="auto"/>
+        <w:rPr>
+          <w:rFonts w:asciiTheme="minorHAnsi" w:hAnsiTheme="minorHAnsi"/>
+          <w:b/>
+          <w:kern w:val="28"/>
+          <w:sz w:val="32"/>
+        </w:rPr>
+      </w:pPr>
+      <w:bookmarkStart w:id="23" w:name="_利用者とのライセンス契約"/>
+      <w:bookmarkStart w:id="24" w:name="_Ref91591286"/>
+      <w:bookmarkEnd w:id="23"/>
+      <w:r>
+        <w:rPr>
+          <w:rFonts w:asciiTheme="minorHAnsi" w:hAnsiTheme="minorHAnsi"/>
+        </w:rPr>
+        <w:br w:type="page"/>
+      </w:r>
+    </w:p>
+    <w:p>
+      <w:pPr>
         <w:pStyle w:val="11"/>
         <w:rPr>
           <w:rFonts w:asciiTheme="minorHAnsi" w:hAnsiTheme="minorHAnsi"/>
         </w:rPr>
       </w:pPr>
-      <w:bookmarkStart w:id="22" w:name="_利用者とのライセンス契約"/>
-      <w:bookmarkStart w:id="23" w:name="_Toc168331360"/>
-      <w:bookmarkStart w:id="24" w:name="_Ref91591286"/>
-      <w:bookmarkEnd w:id="22"/>
+      <w:bookmarkStart w:id="25" w:name="_Toc224117285"/>
       <w:r>
         <w:rPr>
           <w:rFonts w:asciiTheme="minorHAnsi" w:hAnsiTheme="minorHAnsi" w:hint="eastAsia"/>
         </w:rPr>
+        <w:lastRenderedPageBreak/>
         <w:t>S</w:t>
       </w:r>
       <w:r>
@@ -7166,7 +7385,7 @@
         </w:rPr>
         <w:t>upport</w:t>
       </w:r>
-      <w:bookmarkEnd w:id="23"/>
+      <w:bookmarkEnd w:id="25"/>
     </w:p>
     <w:bookmarkEnd w:id="24"/>
     <w:p>
@@ -7260,9 +7479,8 @@
       <w:pPr>
         <w:pStyle w:val="20"/>
       </w:pPr>
-      <w:bookmarkStart w:id="25" w:name="_Toc168331361"/>
-      <w:r>
-        <w:lastRenderedPageBreak/>
+      <w:bookmarkStart w:id="26" w:name="_Toc224117286"/>
+      <w:r>
         <w:t xml:space="preserve">Contact Form in </w:t>
       </w:r>
       <w:proofErr w:type="spellStart"/>
@@ -7279,7 +7497,7 @@
       <w:r>
         <w:t xml:space="preserve"> Support Site</w:t>
       </w:r>
-      <w:bookmarkEnd w:id="25"/>
+      <w:bookmarkEnd w:id="26"/>
     </w:p>
     <w:p>
       <w:pPr>
@@ -7689,7 +7907,25 @@
           <w:szCs w:val="20"/>
           <w:shd w:val="clear" w:color="auto" w:fill="FFFFFF"/>
         </w:rPr>
-        <w:t>fill in you name.</w:t>
+        <w:t xml:space="preserve">fill in </w:t>
+      </w:r>
+      <w:proofErr w:type="gramStart"/>
+      <w:r>
+        <w:rPr>
+          <w:rFonts w:ascii="Century" w:hAnsi="Century" w:cs="Segoe UI"/>
+          <w:szCs w:val="20"/>
+          <w:shd w:val="clear" w:color="auto" w:fill="FFFFFF"/>
+        </w:rPr>
+        <w:t>you</w:t>
+      </w:r>
+      <w:proofErr w:type="gramEnd"/>
+      <w:r>
+        <w:rPr>
+          <w:rFonts w:ascii="Century" w:hAnsi="Century" w:cs="Segoe UI"/>
+          <w:szCs w:val="20"/>
+          <w:shd w:val="clear" w:color="auto" w:fill="FFFFFF"/>
+        </w:rPr>
+        <w:t xml:space="preserve"> name.</w:t>
       </w:r>
     </w:p>
     <w:p>
@@ -7894,7 +8130,27 @@
           <w:sz w:val="22"/>
           <w:szCs w:val="21"/>
         </w:rPr>
-        <w:t>fill in the detail of your inquiry.</w:t>
+        <w:t xml:space="preserve">fill in the </w:t>
+      </w:r>
+      <w:proofErr w:type="gramStart"/>
+      <w:r>
+        <w:rPr>
+          <w:rFonts w:ascii="Century" w:eastAsiaTheme="minorEastAsia" w:hAnsi="Century" w:cstheme="minorBidi"/>
+          <w:kern w:val="2"/>
+          <w:sz w:val="22"/>
+          <w:szCs w:val="21"/>
+        </w:rPr>
+        <w:t>detail</w:t>
+      </w:r>
+      <w:proofErr w:type="gramEnd"/>
+      <w:r>
+        <w:rPr>
+          <w:rFonts w:ascii="Century" w:eastAsiaTheme="minorEastAsia" w:hAnsi="Century" w:cstheme="minorBidi"/>
+          <w:kern w:val="2"/>
+          <w:sz w:val="22"/>
+          <w:szCs w:val="21"/>
+        </w:rPr>
+        <w:t xml:space="preserve"> of your inquiry.</w:t>
       </w:r>
     </w:p>
     <w:p>
@@ -8072,7 +8328,27 @@
           <w:sz w:val="22"/>
           <w:szCs w:val="21"/>
         </w:rPr>
-        <w:t>, refer to "detailed logging" in the section 2.1.</w:t>
+        <w:t xml:space="preserve">, refer to "detailed logging" in </w:t>
+      </w:r>
+      <w:proofErr w:type="gramStart"/>
+      <w:r>
+        <w:rPr>
+          <w:rFonts w:ascii="Century" w:eastAsiaTheme="minorEastAsia" w:hAnsi="Century" w:cstheme="minorBidi"/>
+          <w:kern w:val="2"/>
+          <w:sz w:val="22"/>
+          <w:szCs w:val="21"/>
+        </w:rPr>
+        <w:t>the section</w:t>
+      </w:r>
+      <w:proofErr w:type="gramEnd"/>
+      <w:r>
+        <w:rPr>
+          <w:rFonts w:ascii="Century" w:eastAsiaTheme="minorEastAsia" w:hAnsi="Century" w:cstheme="minorBidi"/>
+          <w:kern w:val="2"/>
+          <w:sz w:val="22"/>
+          <w:szCs w:val="21"/>
+        </w:rPr>
+        <w:t xml:space="preserve"> 2.1.</w:t>
       </w:r>
     </w:p>
     <w:p>
@@ -8099,7 +8375,7 @@
 </file>
 
 <file path=word/endnotes.xml><?xml version="1.0" encoding="utf-8"?>
-<w:endnotes xmlns:wpc="http://schemas.microsoft.com/office/word/2010/wordprocessingCanvas" xmlns:cx="http://schemas.microsoft.com/office/drawing/2014/chartex" xmlns:cx1="http://schemas.microsoft.com/office/drawing/2015/9/8/chartex" xmlns:cx2="http://schemas.microsoft.com/office/drawing/2015/10/21/chartex" xmlns:cx3="http://schemas.microsoft.com/office/drawing/2016/5/9/chartex" xmlns:cx4="http://schemas.microsoft.com/office/drawing/2016/5/10/chartex" xmlns:cx5="http://schemas.microsoft.com/office/drawing/2016/5/11/chartex" xmlns:cx6="http://schemas.microsoft.com/office/drawing/2016/5/12/chartex" xmlns:cx7="http://schemas.microsoft.com/office/drawing/2016/5/13/chartex" xmlns:cx8="http://schemas.microsoft.com/office/drawing/2016/5/14/chartex" xmlns:mc="http://schemas.openxmlformats.org/markup-compatibility/2006" xmlns:aink="http://schemas.microsoft.com/office/drawing/2016/ink" xmlns:am3d="http://schemas.microsoft.com/office/drawing/2017/model3d" xmlns:o="urn:schemas-microsoft-com:office:office" xmlns:oel="http://schemas.microsoft.com/office/2019/extlst" xmlns:r="http://schemas.openxmlformats.org/officeDocument/2006/relationships" xmlns:m="http://schemas.openxmlformats.org/officeDocument/2006/math" xmlns:v="urn:schemas-microsoft-com:vml" xmlns:wp14="http://schemas.microsoft.com/office/word/2010/wordprocessingDrawing" xmlns:wp="http://schemas.openxmlformats.org/drawingml/2006/wordprocessingDrawing" xmlns:w10="urn:schemas-microsoft-com:office:word" xmlns:w="http://schemas.openxmlformats.org/wordprocessingml/2006/main" xmlns:w14="http://schemas.microsoft.com/office/word/2010/wordml" xmlns:w15="http://schemas.microsoft.com/office/word/2012/wordml" xmlns:w16cex="http://schemas.microsoft.com/office/word/2018/wordml/cex" xmlns:w16cid="http://schemas.microsoft.com/office/word/2016/wordml/cid" xmlns:w16="http://schemas.microsoft.com/office/word/2018/wordml" xmlns:w16du="http://schemas.microsoft.com/office/word/2023/wordml/word16du" xmlns:w16sdtdh="http://schemas.microsoft.com/office/word/2020/wordml/sdtdatahash" xmlns:w16se="http://schemas.microsoft.com/office/word/2015/wordml/symex" xmlns:wpg="http://schemas.microsoft.com/office/word/2010/wordprocessingGroup" xmlns:wpi="http://schemas.microsoft.com/office/word/2010/wordprocessingInk" xmlns:wne="http://schemas.microsoft.com/office/word/2006/wordml" xmlns:wps="http://schemas.microsoft.com/office/word/2010/wordprocessingShape" mc:Ignorable="w14 w15 w16se w16cid w16 w16cex w16sdtdh w16du wp14">
+<w:endnotes xmlns:wpc="http://schemas.microsoft.com/office/word/2010/wordprocessingCanvas" xmlns:cx="http://schemas.microsoft.com/office/drawing/2014/chartex" xmlns:cx1="http://schemas.microsoft.com/office/drawing/2015/9/8/chartex" xmlns:cx2="http://schemas.microsoft.com/office/drawing/2015/10/21/chartex" xmlns:cx3="http://schemas.microsoft.com/office/drawing/2016/5/9/chartex" xmlns:cx4="http://schemas.microsoft.com/office/drawing/2016/5/10/chartex" xmlns:cx5="http://schemas.microsoft.com/office/drawing/2016/5/11/chartex" xmlns:cx6="http://schemas.microsoft.com/office/drawing/2016/5/12/chartex" xmlns:cx7="http://schemas.microsoft.com/office/drawing/2016/5/13/chartex" xmlns:cx8="http://schemas.microsoft.com/office/drawing/2016/5/14/chartex" xmlns:mc="http://schemas.openxmlformats.org/markup-compatibility/2006" xmlns:aink="http://schemas.microsoft.com/office/drawing/2016/ink" xmlns:am3d="http://schemas.microsoft.com/office/drawing/2017/model3d" xmlns:o="urn:schemas-microsoft-com:office:office" xmlns:oel="http://schemas.microsoft.com/office/2019/extlst" xmlns:r="http://schemas.openxmlformats.org/officeDocument/2006/relationships" xmlns:m="http://schemas.openxmlformats.org/officeDocument/2006/math" xmlns:v="urn:schemas-microsoft-com:vml" xmlns:wp14="http://schemas.microsoft.com/office/word/2010/wordprocessingDrawing" xmlns:wp="http://schemas.openxmlformats.org/drawingml/2006/wordprocessingDrawing" xmlns:w10="urn:schemas-microsoft-com:office:word" xmlns:w="http://schemas.openxmlformats.org/wordprocessingml/2006/main" xmlns:w14="http://schemas.microsoft.com/office/word/2010/wordml" xmlns:w15="http://schemas.microsoft.com/office/word/2012/wordml" xmlns:w16cex="http://schemas.microsoft.com/office/word/2018/wordml/cex" xmlns:w16cid="http://schemas.microsoft.com/office/word/2016/wordml/cid" xmlns:w16="http://schemas.microsoft.com/office/word/2018/wordml" xmlns:w16du="http://schemas.microsoft.com/office/word/2023/wordml/word16du" xmlns:w16sdtdh="http://schemas.microsoft.com/office/word/2020/wordml/sdtdatahash" xmlns:w16sdtfl="http://schemas.microsoft.com/office/word/2024/wordml/sdtformatlock" xmlns:w16se="http://schemas.microsoft.com/office/word/2015/wordml/symex" xmlns:wpg="http://schemas.microsoft.com/office/word/2010/wordprocessingGroup" xmlns:wpi="http://schemas.microsoft.com/office/word/2010/wordprocessingInk" xmlns:wne="http://schemas.microsoft.com/office/word/2006/wordml" xmlns:wps="http://schemas.microsoft.com/office/word/2010/wordprocessingShape" mc:Ignorable="w14 w15 w16se w16cid w16 w16cex w16sdtdh w16sdtfl w16du wp14">
   <w:endnote w:type="separator" w:id="-1">
     <w:p>
       <w:pPr>
@@ -8131,7 +8407,7 @@
 </file>
 
 <file path=word/footer1.xml><?xml version="1.0" encoding="utf-8"?>
-<w:ftr xmlns:wpc="http://schemas.microsoft.com/office/word/2010/wordprocessingCanvas" xmlns:cx="http://schemas.microsoft.com/office/drawing/2014/chartex" xmlns:cx1="http://schemas.microsoft.com/office/drawing/2015/9/8/chartex" xmlns:cx2="http://schemas.microsoft.com/office/drawing/2015/10/21/chartex" xmlns:cx3="http://schemas.microsoft.com/office/drawing/2016/5/9/chartex" xmlns:cx4="http://schemas.microsoft.com/office/drawing/2016/5/10/chartex" xmlns:cx5="http://schemas.microsoft.com/office/drawing/2016/5/11/chartex" xmlns:cx6="http://schemas.microsoft.com/office/drawing/2016/5/12/chartex" xmlns:cx7="http://schemas.microsoft.com/office/drawing/2016/5/13/chartex" xmlns:cx8="http://schemas.microsoft.com/office/drawing/2016/5/14/chartex" xmlns:mc="http://schemas.openxmlformats.org/markup-compatibility/2006" xmlns:aink="http://schemas.microsoft.com/office/drawing/2016/ink" xmlns:am3d="http://schemas.microsoft.com/office/drawing/2017/model3d" xmlns:o="urn:schemas-microsoft-com:office:office" xmlns:oel="http://schemas.microsoft.com/office/2019/extlst" xmlns:r="http://schemas.openxmlformats.org/officeDocument/2006/relationships" xmlns:m="http://schemas.openxmlformats.org/officeDocument/2006/math" xmlns:v="urn:schemas-microsoft-com:vml" xmlns:wp14="http://schemas.microsoft.com/office/word/2010/wordprocessingDrawing" xmlns:wp="http://schemas.openxmlformats.org/drawingml/2006/wordprocessingDrawing" xmlns:w10="urn:schemas-microsoft-com:office:word" xmlns:w="http://schemas.openxmlformats.org/wordprocessingml/2006/main" xmlns:w14="http://schemas.microsoft.com/office/word/2010/wordml" xmlns:w15="http://schemas.microsoft.com/office/word/2012/wordml" xmlns:w16cex="http://schemas.microsoft.com/office/word/2018/wordml/cex" xmlns:w16cid="http://schemas.microsoft.com/office/word/2016/wordml/cid" xmlns:w16="http://schemas.microsoft.com/office/word/2018/wordml" xmlns:w16du="http://schemas.microsoft.com/office/word/2023/wordml/word16du" xmlns:w16sdtdh="http://schemas.microsoft.com/office/word/2020/wordml/sdtdatahash" xmlns:w16se="http://schemas.microsoft.com/office/word/2015/wordml/symex" xmlns:wpg="http://schemas.microsoft.com/office/word/2010/wordprocessingGroup" xmlns:wpi="http://schemas.microsoft.com/office/word/2010/wordprocessingInk" xmlns:wne="http://schemas.microsoft.com/office/word/2006/wordml" xmlns:wps="http://schemas.microsoft.com/office/word/2010/wordprocessingShape" mc:Ignorable="w14 w15 w16se w16cid w16 w16cex w16sdtdh w16du wp14">
+<w:ftr xmlns:wpc="http://schemas.microsoft.com/office/word/2010/wordprocessingCanvas" xmlns:cx="http://schemas.microsoft.com/office/drawing/2014/chartex" xmlns:cx1="http://schemas.microsoft.com/office/drawing/2015/9/8/chartex" xmlns:cx2="http://schemas.microsoft.com/office/drawing/2015/10/21/chartex" xmlns:cx3="http://schemas.microsoft.com/office/drawing/2016/5/9/chartex" xmlns:cx4="http://schemas.microsoft.com/office/drawing/2016/5/10/chartex" xmlns:cx5="http://schemas.microsoft.com/office/drawing/2016/5/11/chartex" xmlns:cx6="http://schemas.microsoft.com/office/drawing/2016/5/12/chartex" xmlns:cx7="http://schemas.microsoft.com/office/drawing/2016/5/13/chartex" xmlns:cx8="http://schemas.microsoft.com/office/drawing/2016/5/14/chartex" xmlns:mc="http://schemas.openxmlformats.org/markup-compatibility/2006" xmlns:aink="http://schemas.microsoft.com/office/drawing/2016/ink" xmlns:am3d="http://schemas.microsoft.com/office/drawing/2017/model3d" xmlns:o="urn:schemas-microsoft-com:office:office" xmlns:oel="http://schemas.microsoft.com/office/2019/extlst" xmlns:r="http://schemas.openxmlformats.org/officeDocument/2006/relationships" xmlns:m="http://schemas.openxmlformats.org/officeDocument/2006/math" xmlns:v="urn:schemas-microsoft-com:vml" xmlns:wp14="http://schemas.microsoft.com/office/word/2010/wordprocessingDrawing" xmlns:wp="http://schemas.openxmlformats.org/drawingml/2006/wordprocessingDrawing" xmlns:w10="urn:schemas-microsoft-com:office:word" xmlns:w="http://schemas.openxmlformats.org/wordprocessingml/2006/main" xmlns:w14="http://schemas.microsoft.com/office/word/2010/wordml" xmlns:w15="http://schemas.microsoft.com/office/word/2012/wordml" xmlns:w16cex="http://schemas.microsoft.com/office/word/2018/wordml/cex" xmlns:w16cid="http://schemas.microsoft.com/office/word/2016/wordml/cid" xmlns:w16="http://schemas.microsoft.com/office/word/2018/wordml" xmlns:w16du="http://schemas.microsoft.com/office/word/2023/wordml/word16du" xmlns:w16sdtdh="http://schemas.microsoft.com/office/word/2020/wordml/sdtdatahash" xmlns:w16sdtfl="http://schemas.microsoft.com/office/word/2024/wordml/sdtformatlock" xmlns:w16se="http://schemas.microsoft.com/office/word/2015/wordml/symex" xmlns:wpg="http://schemas.microsoft.com/office/word/2010/wordprocessingGroup" xmlns:wpi="http://schemas.microsoft.com/office/word/2010/wordprocessingInk" xmlns:wne="http://schemas.microsoft.com/office/word/2006/wordml" xmlns:wps="http://schemas.microsoft.com/office/word/2010/wordprocessingShape" mc:Ignorable="w14 w15 w16se w16cid w16 w16cex w16sdtdh w16sdtfl w16du wp14">
   <w:p>
     <w:pPr>
       <w:pStyle w:val="ae"/>
@@ -8244,7 +8520,7 @@
               <v:stroke joinstyle="miter"/>
               <v:path gradientshapeok="t" o:connecttype="rect"/>
             </v:shapetype>
-            <v:shape id="Text Box 30" o:spid="_x0000_s1026" type="#_x0000_t202" style="position:absolute;left:0;text-align:left;margin-left:0;margin-top:-.05pt;width:210pt;height:14pt;z-index:251658243;visibility:visible;mso-wrap-style:square;mso-width-percent:0;mso-height-percent:0;mso-wrap-distance-left:9pt;mso-wrap-distance-top:0;mso-wrap-distance-right:9pt;mso-wrap-distance-bottom:0;mso-position-horizontal:absolute;mso-position-horizontal-relative:text;mso-position-vertical:absolute;mso-position-vertical-relative:text;mso-width-percent:0;mso-height-percent:0;mso-width-relative:page;mso-height-relative:page;v-text-anchor:top" o:gfxdata="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" filled="f" stroked="f">
+            <v:shape id="Text Box 30" o:spid="_x0000_s1026" type="#_x0000_t202" style="position:absolute;left:0;text-align:left;margin-left:0;margin-top:-.05pt;width:210pt;height:14pt;z-index:251658243;visibility:visible;mso-wrap-style:square;mso-width-percent:0;mso-height-percent:0;mso-wrap-distance-left:9pt;mso-wrap-distance-top:0;mso-wrap-distance-right:9pt;mso-wrap-distance-bottom:0;mso-position-horizontal:absolute;mso-position-horizontal-relative:text;mso-position-vertical:absolute;mso-position-vertical-relative:text;mso-width-percent:0;mso-height-percent:0;mso-width-relative:page;mso-height-relative:page;v-text-anchor:top" o:gfxdata="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" filled="f" stroked="f">
               <v:textbox style="mso-fit-shape-to-text:t" inset="0,0,0,0">
                 <w:txbxContent>
                   <w:p>
@@ -8310,7 +8586,7 @@
 </file>
 
 <file path=word/footer2.xml><?xml version="1.0" encoding="utf-8"?>
-<w:ftr xmlns:wpc="http://schemas.microsoft.com/office/word/2010/wordprocessingCanvas" xmlns:cx="http://schemas.microsoft.com/office/drawing/2014/chartex" xmlns:cx1="http://schemas.microsoft.com/office/drawing/2015/9/8/chartex" xmlns:cx2="http://schemas.microsoft.com/office/drawing/2015/10/21/chartex" xmlns:cx3="http://schemas.microsoft.com/office/drawing/2016/5/9/chartex" xmlns:cx4="http://schemas.microsoft.com/office/drawing/2016/5/10/chartex" xmlns:cx5="http://schemas.microsoft.com/office/drawing/2016/5/11/chartex" xmlns:cx6="http://schemas.microsoft.com/office/drawing/2016/5/12/chartex" xmlns:cx7="http://schemas.microsoft.com/office/drawing/2016/5/13/chartex" xmlns:cx8="http://schemas.microsoft.com/office/drawing/2016/5/14/chartex" xmlns:mc="http://schemas.openxmlformats.org/markup-compatibility/2006" xmlns:aink="http://schemas.microsoft.com/office/drawing/2016/ink" xmlns:am3d="http://schemas.microsoft.com/office/drawing/2017/model3d" xmlns:o="urn:schemas-microsoft-com:office:office" xmlns:oel="http://schemas.microsoft.com/office/2019/extlst" xmlns:r="http://schemas.openxmlformats.org/officeDocument/2006/relationships" xmlns:m="http://schemas.openxmlformats.org/officeDocument/2006/math" xmlns:v="urn:schemas-microsoft-com:vml" xmlns:wp14="http://schemas.microsoft.com/office/word/2010/wordprocessingDrawing" xmlns:wp="http://schemas.openxmlformats.org/drawingml/2006/wordprocessingDrawing" xmlns:w10="urn:schemas-microsoft-com:office:word" xmlns:w="http://schemas.openxmlformats.org/wordprocessingml/2006/main" xmlns:w14="http://schemas.microsoft.com/office/word/2010/wordml" xmlns:w15="http://schemas.microsoft.com/office/word/2012/wordml" xmlns:w16cex="http://schemas.microsoft.com/office/word/2018/wordml/cex" xmlns:w16cid="http://schemas.microsoft.com/office/word/2016/wordml/cid" xmlns:w16="http://schemas.microsoft.com/office/word/2018/wordml" xmlns:w16du="http://schemas.microsoft.com/office/word/2023/wordml/word16du" xmlns:w16sdtdh="http://schemas.microsoft.com/office/word/2020/wordml/sdtdatahash" xmlns:w16se="http://schemas.microsoft.com/office/word/2015/wordml/symex" xmlns:wpg="http://schemas.microsoft.com/office/word/2010/wordprocessingGroup" xmlns:wpi="http://schemas.microsoft.com/office/word/2010/wordprocessingInk" xmlns:wne="http://schemas.microsoft.com/office/word/2006/wordml" xmlns:wps="http://schemas.microsoft.com/office/word/2010/wordprocessingShape" mc:Ignorable="w14 w15 w16se w16cid w16 w16cex w16sdtdh w16du wp14">
+<w:ftr xmlns:wpc="http://schemas.microsoft.com/office/word/2010/wordprocessingCanvas" xmlns:cx="http://schemas.microsoft.com/office/drawing/2014/chartex" xmlns:cx1="http://schemas.microsoft.com/office/drawing/2015/9/8/chartex" xmlns:cx2="http://schemas.microsoft.com/office/drawing/2015/10/21/chartex" xmlns:cx3="http://schemas.microsoft.com/office/drawing/2016/5/9/chartex" xmlns:cx4="http://schemas.microsoft.com/office/drawing/2016/5/10/chartex" xmlns:cx5="http://schemas.microsoft.com/office/drawing/2016/5/11/chartex" xmlns:cx6="http://schemas.microsoft.com/office/drawing/2016/5/12/chartex" xmlns:cx7="http://schemas.microsoft.com/office/drawing/2016/5/13/chartex" xmlns:cx8="http://schemas.microsoft.com/office/drawing/2016/5/14/chartex" xmlns:mc="http://schemas.openxmlformats.org/markup-compatibility/2006" xmlns:aink="http://schemas.microsoft.com/office/drawing/2016/ink" xmlns:am3d="http://schemas.microsoft.com/office/drawing/2017/model3d" xmlns:o="urn:schemas-microsoft-com:office:office" xmlns:oel="http://schemas.microsoft.com/office/2019/extlst" xmlns:r="http://schemas.openxmlformats.org/officeDocument/2006/relationships" xmlns:m="http://schemas.openxmlformats.org/officeDocument/2006/math" xmlns:v="urn:schemas-microsoft-com:vml" xmlns:wp14="http://schemas.microsoft.com/office/word/2010/wordprocessingDrawing" xmlns:wp="http://schemas.openxmlformats.org/drawingml/2006/wordprocessingDrawing" xmlns:w10="urn:schemas-microsoft-com:office:word" xmlns:w="http://schemas.openxmlformats.org/wordprocessingml/2006/main" xmlns:w14="http://schemas.microsoft.com/office/word/2010/wordml" xmlns:w15="http://schemas.microsoft.com/office/word/2012/wordml" xmlns:w16cex="http://schemas.microsoft.com/office/word/2018/wordml/cex" xmlns:w16cid="http://schemas.microsoft.com/office/word/2016/wordml/cid" xmlns:w16="http://schemas.microsoft.com/office/word/2018/wordml" xmlns:w16du="http://schemas.microsoft.com/office/word/2023/wordml/word16du" xmlns:w16sdtdh="http://schemas.microsoft.com/office/word/2020/wordml/sdtdatahash" xmlns:w16sdtfl="http://schemas.microsoft.com/office/word/2024/wordml/sdtformatlock" xmlns:w16se="http://schemas.microsoft.com/office/word/2015/wordml/symex" xmlns:wpg="http://schemas.microsoft.com/office/word/2010/wordprocessingGroup" xmlns:wpi="http://schemas.microsoft.com/office/word/2010/wordprocessingInk" xmlns:wne="http://schemas.microsoft.com/office/word/2006/wordml" xmlns:wps="http://schemas.microsoft.com/office/word/2010/wordprocessingShape" mc:Ignorable="w14 w15 w16se w16cid w16 w16cex w16sdtdh w16sdtfl w16du wp14">
   <w:p>
     <w:pPr>
       <w:pStyle w:val="ae"/>
@@ -8468,7 +8744,7 @@
 </file>
 
 <file path=word/footer3.xml><?xml version="1.0" encoding="utf-8"?>
-<w:ftr xmlns:wpc="http://schemas.microsoft.com/office/word/2010/wordprocessingCanvas" xmlns:cx="http://schemas.microsoft.com/office/drawing/2014/chartex" xmlns:cx1="http://schemas.microsoft.com/office/drawing/2015/9/8/chartex" xmlns:cx2="http://schemas.microsoft.com/office/drawing/2015/10/21/chartex" xmlns:cx3="http://schemas.microsoft.com/office/drawing/2016/5/9/chartex" xmlns:cx4="http://schemas.microsoft.com/office/drawing/2016/5/10/chartex" xmlns:cx5="http://schemas.microsoft.com/office/drawing/2016/5/11/chartex" xmlns:cx6="http://schemas.microsoft.com/office/drawing/2016/5/12/chartex" xmlns:cx7="http://schemas.microsoft.com/office/drawing/2016/5/13/chartex" xmlns:cx8="http://schemas.microsoft.com/office/drawing/2016/5/14/chartex" xmlns:mc="http://schemas.openxmlformats.org/markup-compatibility/2006" xmlns:aink="http://schemas.microsoft.com/office/drawing/2016/ink" xmlns:am3d="http://schemas.microsoft.com/office/drawing/2017/model3d" xmlns:o="urn:schemas-microsoft-com:office:office" xmlns:oel="http://schemas.microsoft.com/office/2019/extlst" xmlns:r="http://schemas.openxmlformats.org/officeDocument/2006/relationships" xmlns:m="http://schemas.openxmlformats.org/officeDocument/2006/math" xmlns:v="urn:schemas-microsoft-com:vml" xmlns:wp14="http://schemas.microsoft.com/office/word/2010/wordprocessingDrawing" xmlns:wp="http://schemas.openxmlformats.org/drawingml/2006/wordprocessingDrawing" xmlns:w10="urn:schemas-microsoft-com:office:word" xmlns:w="http://schemas.openxmlformats.org/wordprocessingml/2006/main" xmlns:w14="http://schemas.microsoft.com/office/word/2010/wordml" xmlns:w15="http://schemas.microsoft.com/office/word/2012/wordml" xmlns:w16cex="http://schemas.microsoft.com/office/word/2018/wordml/cex" xmlns:w16cid="http://schemas.microsoft.com/office/word/2016/wordml/cid" xmlns:w16="http://schemas.microsoft.com/office/word/2018/wordml" xmlns:w16du="http://schemas.microsoft.com/office/word/2023/wordml/word16du" xmlns:w16sdtdh="http://schemas.microsoft.com/office/word/2020/wordml/sdtdatahash" xmlns:w16se="http://schemas.microsoft.com/office/word/2015/wordml/symex" xmlns:wpg="http://schemas.microsoft.com/office/word/2010/wordprocessingGroup" xmlns:wpi="http://schemas.microsoft.com/office/word/2010/wordprocessingInk" xmlns:wne="http://schemas.microsoft.com/office/word/2006/wordml" xmlns:wps="http://schemas.microsoft.com/office/word/2010/wordprocessingShape" mc:Ignorable="w14 w15 w16se w16cid w16 w16cex w16sdtdh w16du wp14">
+<w:ftr xmlns:wpc="http://schemas.microsoft.com/office/word/2010/wordprocessingCanvas" xmlns:cx="http://schemas.microsoft.com/office/drawing/2014/chartex" xmlns:cx1="http://schemas.microsoft.com/office/drawing/2015/9/8/chartex" xmlns:cx2="http://schemas.microsoft.com/office/drawing/2015/10/21/chartex" xmlns:cx3="http://schemas.microsoft.com/office/drawing/2016/5/9/chartex" xmlns:cx4="http://schemas.microsoft.com/office/drawing/2016/5/10/chartex" xmlns:cx5="http://schemas.microsoft.com/office/drawing/2016/5/11/chartex" xmlns:cx6="http://schemas.microsoft.com/office/drawing/2016/5/12/chartex" xmlns:cx7="http://schemas.microsoft.com/office/drawing/2016/5/13/chartex" xmlns:cx8="http://schemas.microsoft.com/office/drawing/2016/5/14/chartex" xmlns:mc="http://schemas.openxmlformats.org/markup-compatibility/2006" xmlns:aink="http://schemas.microsoft.com/office/drawing/2016/ink" xmlns:am3d="http://schemas.microsoft.com/office/drawing/2017/model3d" xmlns:o="urn:schemas-microsoft-com:office:office" xmlns:oel="http://schemas.microsoft.com/office/2019/extlst" xmlns:r="http://schemas.openxmlformats.org/officeDocument/2006/relationships" xmlns:m="http://schemas.openxmlformats.org/officeDocument/2006/math" xmlns:v="urn:schemas-microsoft-com:vml" xmlns:wp14="http://schemas.microsoft.com/office/word/2010/wordprocessingDrawing" xmlns:wp="http://schemas.openxmlformats.org/drawingml/2006/wordprocessingDrawing" xmlns:w10="urn:schemas-microsoft-com:office:word" xmlns:w="http://schemas.openxmlformats.org/wordprocessingml/2006/main" xmlns:w14="http://schemas.microsoft.com/office/word/2010/wordml" xmlns:w15="http://schemas.microsoft.com/office/word/2012/wordml" xmlns:w16cex="http://schemas.microsoft.com/office/word/2018/wordml/cex" xmlns:w16cid="http://schemas.microsoft.com/office/word/2016/wordml/cid" xmlns:w16="http://schemas.microsoft.com/office/word/2018/wordml" xmlns:w16du="http://schemas.microsoft.com/office/word/2023/wordml/word16du" xmlns:w16sdtdh="http://schemas.microsoft.com/office/word/2020/wordml/sdtdatahash" xmlns:w16sdtfl="http://schemas.microsoft.com/office/word/2024/wordml/sdtformatlock" xmlns:w16se="http://schemas.microsoft.com/office/word/2015/wordml/symex" xmlns:wpg="http://schemas.microsoft.com/office/word/2010/wordprocessingGroup" xmlns:wpi="http://schemas.microsoft.com/office/word/2010/wordprocessingInk" xmlns:wne="http://schemas.microsoft.com/office/word/2006/wordml" xmlns:wps="http://schemas.microsoft.com/office/word/2010/wordprocessingShape" mc:Ignorable="w14 w15 w16se w16cid w16 w16cex w16sdtdh w16sdtfl w16du wp14">
   <w:p>
     <w:pPr>
       <w:pStyle w:val="ae"/>
@@ -8626,7 +8902,7 @@
 </file>
 
 <file path=word/footnotes.xml><?xml version="1.0" encoding="utf-8"?>
-<w:footnotes xmlns:wpc="http://schemas.microsoft.com/office/word/2010/wordprocessingCanvas" xmlns:cx="http://schemas.microsoft.com/office/drawing/2014/chartex" xmlns:cx1="http://schemas.microsoft.com/office/drawing/2015/9/8/chartex" xmlns:cx2="http://schemas.microsoft.com/office/drawing/2015/10/21/chartex" xmlns:cx3="http://schemas.microsoft.com/office/drawing/2016/5/9/chartex" xmlns:cx4="http://schemas.microsoft.com/office/drawing/2016/5/10/chartex" xmlns:cx5="http://schemas.microsoft.com/office/drawing/2016/5/11/chartex" xmlns:cx6="http://schemas.microsoft.com/office/drawing/2016/5/12/chartex" xmlns:cx7="http://schemas.microsoft.com/office/drawing/2016/5/13/chartex" xmlns:cx8="http://schemas.microsoft.com/office/drawing/2016/5/14/chartex" xmlns:mc="http://schemas.openxmlformats.org/markup-compatibility/2006" xmlns:aink="http://schemas.microsoft.com/office/drawing/2016/ink" xmlns:am3d="http://schemas.microsoft.com/office/drawing/2017/model3d" xmlns:o="urn:schemas-microsoft-com:office:office" xmlns:oel="http://schemas.microsoft.com/office/2019/extlst" xmlns:r="http://schemas.openxmlformats.org/officeDocument/2006/relationships" xmlns:m="http://schemas.openxmlformats.org/officeDocument/2006/math" xmlns:v="urn:schemas-microsoft-com:vml" xmlns:wp14="http://schemas.microsoft.com/office/word/2010/wordprocessingDrawing" xmlns:wp="http://schemas.openxmlformats.org/drawingml/2006/wordprocessingDrawing" xmlns:w10="urn:schemas-microsoft-com:office:word" xmlns:w="http://schemas.openxmlformats.org/wordprocessingml/2006/main" xmlns:w14="http://schemas.microsoft.com/office/word/2010/wordml" xmlns:w15="http://schemas.microsoft.com/office/word/2012/wordml" xmlns:w16cex="http://schemas.microsoft.com/office/word/2018/wordml/cex" xmlns:w16cid="http://schemas.microsoft.com/office/word/2016/wordml/cid" xmlns:w16="http://schemas.microsoft.com/office/word/2018/wordml" xmlns:w16du="http://schemas.microsoft.com/office/word/2023/wordml/word16du" xmlns:w16sdtdh="http://schemas.microsoft.com/office/word/2020/wordml/sdtdatahash" xmlns:w16se="http://schemas.microsoft.com/office/word/2015/wordml/symex" xmlns:wpg="http://schemas.microsoft.com/office/word/2010/wordprocessingGroup" xmlns:wpi="http://schemas.microsoft.com/office/word/2010/wordprocessingInk" xmlns:wne="http://schemas.microsoft.com/office/word/2006/wordml" xmlns:wps="http://schemas.microsoft.com/office/word/2010/wordprocessingShape" mc:Ignorable="w14 w15 w16se w16cid w16 w16cex w16sdtdh w16du wp14">
+<w:footnotes xmlns:wpc="http://schemas.microsoft.com/office/word/2010/wordprocessingCanvas" xmlns:cx="http://schemas.microsoft.com/office/drawing/2014/chartex" xmlns:cx1="http://schemas.microsoft.com/office/drawing/2015/9/8/chartex" xmlns:cx2="http://schemas.microsoft.com/office/drawing/2015/10/21/chartex" xmlns:cx3="http://schemas.microsoft.com/office/drawing/2016/5/9/chartex" xmlns:cx4="http://schemas.microsoft.com/office/drawing/2016/5/10/chartex" xmlns:cx5="http://schemas.microsoft.com/office/drawing/2016/5/11/chartex" xmlns:cx6="http://schemas.microsoft.com/office/drawing/2016/5/12/chartex" xmlns:cx7="http://schemas.microsoft.com/office/drawing/2016/5/13/chartex" xmlns:cx8="http://schemas.microsoft.com/office/drawing/2016/5/14/chartex" xmlns:mc="http://schemas.openxmlformats.org/markup-compatibility/2006" xmlns:aink="http://schemas.microsoft.com/office/drawing/2016/ink" xmlns:am3d="http://schemas.microsoft.com/office/drawing/2017/model3d" xmlns:o="urn:schemas-microsoft-com:office:office" xmlns:oel="http://schemas.microsoft.com/office/2019/extlst" xmlns:r="http://schemas.openxmlformats.org/officeDocument/2006/relationships" xmlns:m="http://schemas.openxmlformats.org/officeDocument/2006/math" xmlns:v="urn:schemas-microsoft-com:vml" xmlns:wp14="http://schemas.microsoft.com/office/word/2010/wordprocessingDrawing" xmlns:wp="http://schemas.openxmlformats.org/drawingml/2006/wordprocessingDrawing" xmlns:w10="urn:schemas-microsoft-com:office:word" xmlns:w="http://schemas.openxmlformats.org/wordprocessingml/2006/main" xmlns:w14="http://schemas.microsoft.com/office/word/2010/wordml" xmlns:w15="http://schemas.microsoft.com/office/word/2012/wordml" xmlns:w16cex="http://schemas.microsoft.com/office/word/2018/wordml/cex" xmlns:w16cid="http://schemas.microsoft.com/office/word/2016/wordml/cid" xmlns:w16="http://schemas.microsoft.com/office/word/2018/wordml" xmlns:w16du="http://schemas.microsoft.com/office/word/2023/wordml/word16du" xmlns:w16sdtdh="http://schemas.microsoft.com/office/word/2020/wordml/sdtdatahash" xmlns:w16sdtfl="http://schemas.microsoft.com/office/word/2024/wordml/sdtformatlock" xmlns:w16se="http://schemas.microsoft.com/office/word/2015/wordml/symex" xmlns:wpg="http://schemas.microsoft.com/office/word/2010/wordprocessingGroup" xmlns:wpi="http://schemas.microsoft.com/office/word/2010/wordprocessingInk" xmlns:wne="http://schemas.microsoft.com/office/word/2006/wordml" xmlns:wps="http://schemas.microsoft.com/office/word/2010/wordprocessingShape" mc:Ignorable="w14 w15 w16se w16cid w16 w16cex w16sdtdh w16sdtfl w16du wp14">
   <w:footnote w:type="separator" w:id="-1">
     <w:p>
       <w:pPr>
@@ -8658,7 +8934,7 @@
 </file>
 
 <file path=word/header1.xml><?xml version="1.0" encoding="utf-8"?>
-<w:hdr xmlns:wpc="http://schemas.microsoft.com/office/word/2010/wordprocessingCanvas" xmlns:cx="http://schemas.microsoft.com/office/drawing/2014/chartex" xmlns:cx1="http://schemas.microsoft.com/office/drawing/2015/9/8/chartex" xmlns:cx2="http://schemas.microsoft.com/office/drawing/2015/10/21/chartex" xmlns:cx3="http://schemas.microsoft.com/office/drawing/2016/5/9/chartex" xmlns:cx4="http://schemas.microsoft.com/office/drawing/2016/5/10/chartex" xmlns:cx5="http://schemas.microsoft.com/office/drawing/2016/5/11/chartex" xmlns:cx6="http://schemas.microsoft.com/office/drawing/2016/5/12/chartex" xmlns:cx7="http://schemas.microsoft.com/office/drawing/2016/5/13/chartex" xmlns:cx8="http://schemas.microsoft.com/office/drawing/2016/5/14/chartex" xmlns:mc="http://schemas.openxmlformats.org/markup-compatibility/2006" xmlns:aink="http://schemas.microsoft.com/office/drawing/2016/ink" xmlns:am3d="http://schemas.microsoft.com/office/drawing/2017/model3d" xmlns:o="urn:schemas-microsoft-com:office:office" xmlns:oel="http://schemas.microsoft.com/office/2019/extlst" xmlns:r="http://schemas.openxmlformats.org/officeDocument/2006/relationships" xmlns:m="http://schemas.openxmlformats.org/officeDocument/2006/math" xmlns:v="urn:schemas-microsoft-com:vml" xmlns:wp14="http://schemas.microsoft.com/office/word/2010/wordprocessingDrawing" xmlns:wp="http://schemas.openxmlformats.org/drawingml/2006/wordprocessingDrawing" xmlns:w10="urn:schemas-microsoft-com:office:word" xmlns:w="http://schemas.openxmlformats.org/wordprocessingml/2006/main" xmlns:w14="http://schemas.microsoft.com/office/word/2010/wordml" xmlns:w15="http://schemas.microsoft.com/office/word/2012/wordml" xmlns:w16cex="http://schemas.microsoft.com/office/word/2018/wordml/cex" xmlns:w16cid="http://schemas.microsoft.com/office/word/2016/wordml/cid" xmlns:w16="http://schemas.microsoft.com/office/word/2018/wordml" xmlns:w16du="http://schemas.microsoft.com/office/word/2023/wordml/word16du" xmlns:w16sdtdh="http://schemas.microsoft.com/office/word/2020/wordml/sdtdatahash" xmlns:w16se="http://schemas.microsoft.com/office/word/2015/wordml/symex" xmlns:wpg="http://schemas.microsoft.com/office/word/2010/wordprocessingGroup" xmlns:wpi="http://schemas.microsoft.com/office/word/2010/wordprocessingInk" xmlns:wne="http://schemas.microsoft.com/office/word/2006/wordml" xmlns:wps="http://schemas.microsoft.com/office/word/2010/wordprocessingShape" mc:Ignorable="w14 w15 w16se w16cid w16 w16cex w16sdtdh w16du wp14">
+<w:hdr xmlns:wpc="http://schemas.microsoft.com/office/word/2010/wordprocessingCanvas" xmlns:cx="http://schemas.microsoft.com/office/drawing/2014/chartex" xmlns:cx1="http://schemas.microsoft.com/office/drawing/2015/9/8/chartex" xmlns:cx2="http://schemas.microsoft.com/office/drawing/2015/10/21/chartex" xmlns:cx3="http://schemas.microsoft.com/office/drawing/2016/5/9/chartex" xmlns:cx4="http://schemas.microsoft.com/office/drawing/2016/5/10/chartex" xmlns:cx5="http://schemas.microsoft.com/office/drawing/2016/5/11/chartex" xmlns:cx6="http://schemas.microsoft.com/office/drawing/2016/5/12/chartex" xmlns:cx7="http://schemas.microsoft.com/office/drawing/2016/5/13/chartex" xmlns:cx8="http://schemas.microsoft.com/office/drawing/2016/5/14/chartex" xmlns:mc="http://schemas.openxmlformats.org/markup-compatibility/2006" xmlns:aink="http://schemas.microsoft.com/office/drawing/2016/ink" xmlns:am3d="http://schemas.microsoft.com/office/drawing/2017/model3d" xmlns:o="urn:schemas-microsoft-com:office:office" xmlns:oel="http://schemas.microsoft.com/office/2019/extlst" xmlns:r="http://schemas.openxmlformats.org/officeDocument/2006/relationships" xmlns:m="http://schemas.openxmlformats.org/officeDocument/2006/math" xmlns:v="urn:schemas-microsoft-com:vml" xmlns:wp14="http://schemas.microsoft.com/office/word/2010/wordprocessingDrawing" xmlns:wp="http://schemas.openxmlformats.org/drawingml/2006/wordprocessingDrawing" xmlns:w10="urn:schemas-microsoft-com:office:word" xmlns:w="http://schemas.openxmlformats.org/wordprocessingml/2006/main" xmlns:w14="http://schemas.microsoft.com/office/word/2010/wordml" xmlns:w15="http://schemas.microsoft.com/office/word/2012/wordml" xmlns:w16cex="http://schemas.microsoft.com/office/word/2018/wordml/cex" xmlns:w16cid="http://schemas.microsoft.com/office/word/2016/wordml/cid" xmlns:w16="http://schemas.microsoft.com/office/word/2018/wordml" xmlns:w16du="http://schemas.microsoft.com/office/word/2023/wordml/word16du" xmlns:w16sdtdh="http://schemas.microsoft.com/office/word/2020/wordml/sdtdatahash" xmlns:w16sdtfl="http://schemas.microsoft.com/office/word/2024/wordml/sdtformatlock" xmlns:w16se="http://schemas.microsoft.com/office/word/2015/wordml/symex" xmlns:wpg="http://schemas.microsoft.com/office/word/2010/wordprocessingGroup" xmlns:wpi="http://schemas.microsoft.com/office/word/2010/wordprocessingInk" xmlns:wne="http://schemas.microsoft.com/office/word/2006/wordml" xmlns:wps="http://schemas.microsoft.com/office/word/2010/wordprocessingShape" mc:Ignorable="w14 w15 w16se w16cid w16 w16cex w16sdtdh w16sdtfl w16du wp14">
   <w:p>
     <w:pPr>
       <w:pStyle w:val="af3"/>
@@ -8722,7 +8998,7 @@
 </file>
 
 <file path=word/header2.xml><?xml version="1.0" encoding="utf-8"?>
-<w:hdr xmlns:wpc="http://schemas.microsoft.com/office/word/2010/wordprocessingCanvas" xmlns:cx="http://schemas.microsoft.com/office/drawing/2014/chartex" xmlns:cx1="http://schemas.microsoft.com/office/drawing/2015/9/8/chartex" xmlns:cx2="http://schemas.microsoft.com/office/drawing/2015/10/21/chartex" xmlns:cx3="http://schemas.microsoft.com/office/drawing/2016/5/9/chartex" xmlns:cx4="http://schemas.microsoft.com/office/drawing/2016/5/10/chartex" xmlns:cx5="http://schemas.microsoft.com/office/drawing/2016/5/11/chartex" xmlns:cx6="http://schemas.microsoft.com/office/drawing/2016/5/12/chartex" xmlns:cx7="http://schemas.microsoft.com/office/drawing/2016/5/13/chartex" xmlns:cx8="http://schemas.microsoft.com/office/drawing/2016/5/14/chartex" xmlns:mc="http://schemas.openxmlformats.org/markup-compatibility/2006" xmlns:aink="http://schemas.microsoft.com/office/drawing/2016/ink" xmlns:am3d="http://schemas.microsoft.com/office/drawing/2017/model3d" xmlns:o="urn:schemas-microsoft-com:office:office" xmlns:oel="http://schemas.microsoft.com/office/2019/extlst" xmlns:r="http://schemas.openxmlformats.org/officeDocument/2006/relationships" xmlns:m="http://schemas.openxmlformats.org/officeDocument/2006/math" xmlns:v="urn:schemas-microsoft-com:vml" xmlns:wp14="http://schemas.microsoft.com/office/word/2010/wordprocessingDrawing" xmlns:wp="http://schemas.openxmlformats.org/drawingml/2006/wordprocessingDrawing" xmlns:w10="urn:schemas-microsoft-com:office:word" xmlns:w="http://schemas.openxmlformats.org/wordprocessingml/2006/main" xmlns:w14="http://schemas.microsoft.com/office/word/2010/wordml" xmlns:w15="http://schemas.microsoft.com/office/word/2012/wordml" xmlns:w16cex="http://schemas.microsoft.com/office/word/2018/wordml/cex" xmlns:w16cid="http://schemas.microsoft.com/office/word/2016/wordml/cid" xmlns:w16="http://schemas.microsoft.com/office/word/2018/wordml" xmlns:w16du="http://schemas.microsoft.com/office/word/2023/wordml/word16du" xmlns:w16sdtdh="http://schemas.microsoft.com/office/word/2020/wordml/sdtdatahash" xmlns:w16se="http://schemas.microsoft.com/office/word/2015/wordml/symex" xmlns:wpg="http://schemas.microsoft.com/office/word/2010/wordprocessingGroup" xmlns:wpi="http://schemas.microsoft.com/office/word/2010/wordprocessingInk" xmlns:wne="http://schemas.microsoft.com/office/word/2006/wordml" xmlns:wps="http://schemas.microsoft.com/office/word/2010/wordprocessingShape" mc:Ignorable="w14 w15 w16se w16cid w16 w16cex w16sdtdh w16du wp14">
+<w:hdr xmlns:wpc="http://schemas.microsoft.com/office/word/2010/wordprocessingCanvas" xmlns:cx="http://schemas.microsoft.com/office/drawing/2014/chartex" xmlns:cx1="http://schemas.microsoft.com/office/drawing/2015/9/8/chartex" xmlns:cx2="http://schemas.microsoft.com/office/drawing/2015/10/21/chartex" xmlns:cx3="http://schemas.microsoft.com/office/drawing/2016/5/9/chartex" xmlns:cx4="http://schemas.microsoft.com/office/drawing/2016/5/10/chartex" xmlns:cx5="http://schemas.microsoft.com/office/drawing/2016/5/11/chartex" xmlns:cx6="http://schemas.microsoft.com/office/drawing/2016/5/12/chartex" xmlns:cx7="http://schemas.microsoft.com/office/drawing/2016/5/13/chartex" xmlns:cx8="http://schemas.microsoft.com/office/drawing/2016/5/14/chartex" xmlns:mc="http://schemas.openxmlformats.org/markup-compatibility/2006" xmlns:aink="http://schemas.microsoft.com/office/drawing/2016/ink" xmlns:am3d="http://schemas.microsoft.com/office/drawing/2017/model3d" xmlns:o="urn:schemas-microsoft-com:office:office" xmlns:oel="http://schemas.microsoft.com/office/2019/extlst" xmlns:r="http://schemas.openxmlformats.org/officeDocument/2006/relationships" xmlns:m="http://schemas.openxmlformats.org/officeDocument/2006/math" xmlns:v="urn:schemas-microsoft-com:vml" xmlns:wp14="http://schemas.microsoft.com/office/word/2010/wordprocessingDrawing" xmlns:wp="http://schemas.openxmlformats.org/drawingml/2006/wordprocessingDrawing" xmlns:w10="urn:schemas-microsoft-com:office:word" xmlns:w="http://schemas.openxmlformats.org/wordprocessingml/2006/main" xmlns:w14="http://schemas.microsoft.com/office/word/2010/wordml" xmlns:w15="http://schemas.microsoft.com/office/word/2012/wordml" xmlns:w16cex="http://schemas.microsoft.com/office/word/2018/wordml/cex" xmlns:w16cid="http://schemas.microsoft.com/office/word/2016/wordml/cid" xmlns:w16="http://schemas.microsoft.com/office/word/2018/wordml" xmlns:w16du="http://schemas.microsoft.com/office/word/2023/wordml/word16du" xmlns:w16sdtdh="http://schemas.microsoft.com/office/word/2020/wordml/sdtdatahash" xmlns:w16sdtfl="http://schemas.microsoft.com/office/word/2024/wordml/sdtformatlock" xmlns:w16se="http://schemas.microsoft.com/office/word/2015/wordml/symex" xmlns:wpg="http://schemas.microsoft.com/office/word/2010/wordprocessingGroup" xmlns:wpi="http://schemas.microsoft.com/office/word/2010/wordprocessingInk" xmlns:wne="http://schemas.microsoft.com/office/word/2006/wordml" xmlns:wps="http://schemas.microsoft.com/office/word/2010/wordprocessingShape" mc:Ignorable="w14 w15 w16se w16cid w16 w16cex w16sdtdh w16sdtfl w16du wp14">
   <w:p>
     <w:pPr>
       <w:pStyle w:val="af3"/>
@@ -8810,7 +9086,7 @@
 </file>
 
 <file path=word/header3.xml><?xml version="1.0" encoding="utf-8"?>
-<w:hdr xmlns:wpc="http://schemas.microsoft.com/office/word/2010/wordprocessingCanvas" xmlns:cx="http://schemas.microsoft.com/office/drawing/2014/chartex" xmlns:cx1="http://schemas.microsoft.com/office/drawing/2015/9/8/chartex" xmlns:cx2="http://schemas.microsoft.com/office/drawing/2015/10/21/chartex" xmlns:cx3="http://schemas.microsoft.com/office/drawing/2016/5/9/chartex" xmlns:cx4="http://schemas.microsoft.com/office/drawing/2016/5/10/chartex" xmlns:cx5="http://schemas.microsoft.com/office/drawing/2016/5/11/chartex" xmlns:cx6="http://schemas.microsoft.com/office/drawing/2016/5/12/chartex" xmlns:cx7="http://schemas.microsoft.com/office/drawing/2016/5/13/chartex" xmlns:cx8="http://schemas.microsoft.com/office/drawing/2016/5/14/chartex" xmlns:mc="http://schemas.openxmlformats.org/markup-compatibility/2006" xmlns:aink="http://schemas.microsoft.com/office/drawing/2016/ink" xmlns:am3d="http://schemas.microsoft.com/office/drawing/2017/model3d" xmlns:o="urn:schemas-microsoft-com:office:office" xmlns:oel="http://schemas.microsoft.com/office/2019/extlst" xmlns:r="http://schemas.openxmlformats.org/officeDocument/2006/relationships" xmlns:m="http://schemas.openxmlformats.org/officeDocument/2006/math" xmlns:v="urn:schemas-microsoft-com:vml" xmlns:wp14="http://schemas.microsoft.com/office/word/2010/wordprocessingDrawing" xmlns:wp="http://schemas.openxmlformats.org/drawingml/2006/wordprocessingDrawing" xmlns:w10="urn:schemas-microsoft-com:office:word" xmlns:w="http://schemas.openxmlformats.org/wordprocessingml/2006/main" xmlns:w14="http://schemas.microsoft.com/office/word/2010/wordml" xmlns:w15="http://schemas.microsoft.com/office/word/2012/wordml" xmlns:w16cex="http://schemas.microsoft.com/office/word/2018/wordml/cex" xmlns:w16cid="http://schemas.microsoft.com/office/word/2016/wordml/cid" xmlns:w16="http://schemas.microsoft.com/office/word/2018/wordml" xmlns:w16du="http://schemas.microsoft.com/office/word/2023/wordml/word16du" xmlns:w16sdtdh="http://schemas.microsoft.com/office/word/2020/wordml/sdtdatahash" xmlns:w16se="http://schemas.microsoft.com/office/word/2015/wordml/symex" xmlns:wpg="http://schemas.microsoft.com/office/word/2010/wordprocessingGroup" xmlns:wpi="http://schemas.microsoft.com/office/word/2010/wordprocessingInk" xmlns:wne="http://schemas.microsoft.com/office/word/2006/wordml" xmlns:wps="http://schemas.microsoft.com/office/word/2010/wordprocessingShape" mc:Ignorable="w14 w15 w16se w16cid w16 w16cex w16sdtdh w16du wp14">
+<w:hdr xmlns:wpc="http://schemas.microsoft.com/office/word/2010/wordprocessingCanvas" xmlns:cx="http://schemas.microsoft.com/office/drawing/2014/chartex" xmlns:cx1="http://schemas.microsoft.com/office/drawing/2015/9/8/chartex" xmlns:cx2="http://schemas.microsoft.com/office/drawing/2015/10/21/chartex" xmlns:cx3="http://schemas.microsoft.com/office/drawing/2016/5/9/chartex" xmlns:cx4="http://schemas.microsoft.com/office/drawing/2016/5/10/chartex" xmlns:cx5="http://schemas.microsoft.com/office/drawing/2016/5/11/chartex" xmlns:cx6="http://schemas.microsoft.com/office/drawing/2016/5/12/chartex" xmlns:cx7="http://schemas.microsoft.com/office/drawing/2016/5/13/chartex" xmlns:cx8="http://schemas.microsoft.com/office/drawing/2016/5/14/chartex" xmlns:mc="http://schemas.openxmlformats.org/markup-compatibility/2006" xmlns:aink="http://schemas.microsoft.com/office/drawing/2016/ink" xmlns:am3d="http://schemas.microsoft.com/office/drawing/2017/model3d" xmlns:o="urn:schemas-microsoft-com:office:office" xmlns:oel="http://schemas.microsoft.com/office/2019/extlst" xmlns:r="http://schemas.openxmlformats.org/officeDocument/2006/relationships" xmlns:m="http://schemas.openxmlformats.org/officeDocument/2006/math" xmlns:v="urn:schemas-microsoft-com:vml" xmlns:wp14="http://schemas.microsoft.com/office/word/2010/wordprocessingDrawing" xmlns:wp="http://schemas.openxmlformats.org/drawingml/2006/wordprocessingDrawing" xmlns:w10="urn:schemas-microsoft-com:office:word" xmlns:w="http://schemas.openxmlformats.org/wordprocessingml/2006/main" xmlns:w14="http://schemas.microsoft.com/office/word/2010/wordml" xmlns:w15="http://schemas.microsoft.com/office/word/2012/wordml" xmlns:w16cex="http://schemas.microsoft.com/office/word/2018/wordml/cex" xmlns:w16cid="http://schemas.microsoft.com/office/word/2016/wordml/cid" xmlns:w16="http://schemas.microsoft.com/office/word/2018/wordml" xmlns:w16du="http://schemas.microsoft.com/office/word/2023/wordml/word16du" xmlns:w16sdtdh="http://schemas.microsoft.com/office/word/2020/wordml/sdtdatahash" xmlns:w16sdtfl="http://schemas.microsoft.com/office/word/2024/wordml/sdtformatlock" xmlns:w16se="http://schemas.microsoft.com/office/word/2015/wordml/symex" xmlns:wpg="http://schemas.microsoft.com/office/word/2010/wordprocessingGroup" xmlns:wpi="http://schemas.microsoft.com/office/word/2010/wordprocessingInk" xmlns:wne="http://schemas.microsoft.com/office/word/2006/wordml" xmlns:wps="http://schemas.microsoft.com/office/word/2010/wordprocessingShape" mc:Ignorable="w14 w15 w16se w16cid w16 w16cex w16sdtdh w16sdtfl w16du wp14">
   <w:p>
     <w:pPr>
       <w:pStyle w:val="af3"/>
@@ -8898,7 +9174,7 @@
 </file>
 
 <file path=word/numbering.xml><?xml version="1.0" encoding="utf-8"?>
-<w:numbering xmlns:wpc="http://schemas.microsoft.com/office/word/2010/wordprocessingCanvas" xmlns:cx="http://schemas.microsoft.com/office/drawing/2014/chartex" xmlns:cx1="http://schemas.microsoft.com/office/drawing/2015/9/8/chartex" xmlns:cx2="http://schemas.microsoft.com/office/drawing/2015/10/21/chartex" xmlns:cx3="http://schemas.microsoft.com/office/drawing/2016/5/9/chartex" xmlns:cx4="http://schemas.microsoft.com/office/drawing/2016/5/10/chartex" xmlns:cx5="http://schemas.microsoft.com/office/drawing/2016/5/11/chartex" xmlns:cx6="http://schemas.microsoft.com/office/drawing/2016/5/12/chartex" xmlns:cx7="http://schemas.microsoft.com/office/drawing/2016/5/13/chartex" xmlns:cx8="http://schemas.microsoft.com/office/drawing/2016/5/14/chartex" xmlns:mc="http://schemas.openxmlformats.org/markup-compatibility/2006" xmlns:aink="http://schemas.microsoft.com/office/drawing/2016/ink" xmlns:am3d="http://schemas.microsoft.com/office/drawing/2017/model3d" xmlns:o="urn:schemas-microsoft-com:office:office" xmlns:oel="http://schemas.microsoft.com/office/2019/extlst" xmlns:r="http://schemas.openxmlformats.org/officeDocument/2006/relationships" xmlns:m="http://schemas.openxmlformats.org/officeDocument/2006/math" xmlns:v="urn:schemas-microsoft-com:vml" xmlns:wp14="http://schemas.microsoft.com/office/word/2010/wordprocessingDrawing" xmlns:wp="http://schemas.openxmlformats.org/drawingml/2006/wordprocessingDrawing" xmlns:w10="urn:schemas-microsoft-com:office:word" xmlns:w="http://schemas.openxmlformats.org/wordprocessingml/2006/main" xmlns:w14="http://schemas.microsoft.com/office/word/2010/wordml" xmlns:w15="http://schemas.microsoft.com/office/word/2012/wordml" xmlns:w16cex="http://schemas.microsoft.com/office/word/2018/wordml/cex" xmlns:w16cid="http://schemas.microsoft.com/office/word/2016/wordml/cid" xmlns:w16="http://schemas.microsoft.com/office/word/2018/wordml" xmlns:w16du="http://schemas.microsoft.com/office/word/2023/wordml/word16du" xmlns:w16sdtdh="http://schemas.microsoft.com/office/word/2020/wordml/sdtdatahash" xmlns:w16se="http://schemas.microsoft.com/office/word/2015/wordml/symex" xmlns:wpg="http://schemas.microsoft.com/office/word/2010/wordprocessingGroup" xmlns:wpi="http://schemas.microsoft.com/office/word/2010/wordprocessingInk" xmlns:wne="http://schemas.microsoft.com/office/word/2006/wordml" xmlns:wps="http://schemas.microsoft.com/office/word/2010/wordprocessingShape" mc:Ignorable="w14 w15 w16se w16cid w16 w16cex w16sdtdh w16du wp14">
+<w:numbering xmlns:wpc="http://schemas.microsoft.com/office/word/2010/wordprocessingCanvas" xmlns:cx="http://schemas.microsoft.com/office/drawing/2014/chartex" xmlns:cx1="http://schemas.microsoft.com/office/drawing/2015/9/8/chartex" xmlns:cx2="http://schemas.microsoft.com/office/drawing/2015/10/21/chartex" xmlns:cx3="http://schemas.microsoft.com/office/drawing/2016/5/9/chartex" xmlns:cx4="http://schemas.microsoft.com/office/drawing/2016/5/10/chartex" xmlns:cx5="http://schemas.microsoft.com/office/drawing/2016/5/11/chartex" xmlns:cx6="http://schemas.microsoft.com/office/drawing/2016/5/12/chartex" xmlns:cx7="http://schemas.microsoft.com/office/drawing/2016/5/13/chartex" xmlns:cx8="http://schemas.microsoft.com/office/drawing/2016/5/14/chartex" xmlns:mc="http://schemas.openxmlformats.org/markup-compatibility/2006" xmlns:aink="http://schemas.microsoft.com/office/drawing/2016/ink" xmlns:am3d="http://schemas.microsoft.com/office/drawing/2017/model3d" xmlns:o="urn:schemas-microsoft-com:office:office" xmlns:oel="http://schemas.microsoft.com/office/2019/extlst" xmlns:r="http://schemas.openxmlformats.org/officeDocument/2006/relationships" xmlns:m="http://schemas.openxmlformats.org/officeDocument/2006/math" xmlns:v="urn:schemas-microsoft-com:vml" xmlns:wp14="http://schemas.microsoft.com/office/word/2010/wordprocessingDrawing" xmlns:wp="http://schemas.openxmlformats.org/drawingml/2006/wordprocessingDrawing" xmlns:w10="urn:schemas-microsoft-com:office:word" xmlns:w="http://schemas.openxmlformats.org/wordprocessingml/2006/main" xmlns:w14="http://schemas.microsoft.com/office/word/2010/wordml" xmlns:w15="http://schemas.microsoft.com/office/word/2012/wordml" xmlns:w16cex="http://schemas.microsoft.com/office/word/2018/wordml/cex" xmlns:w16cid="http://schemas.microsoft.com/office/word/2016/wordml/cid" xmlns:w16="http://schemas.microsoft.com/office/word/2018/wordml" xmlns:w16du="http://schemas.microsoft.com/office/word/2023/wordml/word16du" xmlns:w16sdtdh="http://schemas.microsoft.com/office/word/2020/wordml/sdtdatahash" xmlns:w16sdtfl="http://schemas.microsoft.com/office/word/2024/wordml/sdtformatlock" xmlns:w16se="http://schemas.microsoft.com/office/word/2015/wordml/symex" xmlns:wpg="http://schemas.microsoft.com/office/word/2010/wordprocessingGroup" xmlns:wpi="http://schemas.microsoft.com/office/word/2010/wordprocessingInk" xmlns:wne="http://schemas.microsoft.com/office/word/2006/wordml" xmlns:wps="http://schemas.microsoft.com/office/word/2010/wordprocessingShape" mc:Ignorable="w14 w15 w16se w16cid w16 w16cex w16sdtdh w16sdtfl w16du wp14">
   <w:abstractNum w:abstractNumId="0" w15:restartNumberingAfterBreak="0">
     <w:nsid w:val="03783546"/>
     <w:multiLevelType w:val="hybridMultilevel"/>
@@ -11211,7 +11487,7 @@
       <w:lvlText w:val="%1.%2."/>
       <w:lvlJc w:val="left"/>
       <w:pPr>
-        <w:ind w:left="567" w:hanging="567"/>
+        <w:ind w:left="6663" w:hanging="567"/>
       </w:pPr>
       <w:rPr>
         <w:rFonts w:hint="eastAsia"/>
@@ -12299,7 +12575,7 @@
 </file>
 
 <file path=word/styles.xml><?xml version="1.0" encoding="utf-8"?>
-<w:styles xmlns:mc="http://schemas.openxmlformats.org/markup-compatibility/2006" xmlns:r="http://schemas.openxmlformats.org/officeDocument/2006/relationships" xmlns:w="http://schemas.openxmlformats.org/wordprocessingml/2006/main" xmlns:w14="http://schemas.microsoft.com/office/word/2010/wordml" xmlns:w15="http://schemas.microsoft.com/office/word/2012/wordml" xmlns:w16cex="http://schemas.microsoft.com/office/word/2018/wordml/cex" xmlns:w16cid="http://schemas.microsoft.com/office/word/2016/wordml/cid" xmlns:w16="http://schemas.microsoft.com/office/word/2018/wordml" xmlns:w16du="http://schemas.microsoft.com/office/word/2023/wordml/word16du" xmlns:w16sdtdh="http://schemas.microsoft.com/office/word/2020/wordml/sdtdatahash" xmlns:w16se="http://schemas.microsoft.com/office/word/2015/wordml/symex" mc:Ignorable="w14 w15 w16se w16cid w16 w16cex w16sdtdh w16du">
+<w:styles xmlns:mc="http://schemas.openxmlformats.org/markup-compatibility/2006" xmlns:r="http://schemas.openxmlformats.org/officeDocument/2006/relationships" xmlns:w="http://schemas.openxmlformats.org/wordprocessingml/2006/main" xmlns:w14="http://schemas.microsoft.com/office/word/2010/wordml" xmlns:w15="http://schemas.microsoft.com/office/word/2012/wordml" xmlns:w16cex="http://schemas.microsoft.com/office/word/2018/wordml/cex" xmlns:w16cid="http://schemas.microsoft.com/office/word/2016/wordml/cid" xmlns:w16="http://schemas.microsoft.com/office/word/2018/wordml" xmlns:w16du="http://schemas.microsoft.com/office/word/2023/wordml/word16du" xmlns:w16sdtdh="http://schemas.microsoft.com/office/word/2020/wordml/sdtdatahash" xmlns:w16sdtfl="http://schemas.microsoft.com/office/word/2024/wordml/sdtformatlock" xmlns:w16se="http://schemas.microsoft.com/office/word/2015/wordml/symex" mc:Ignorable="w14 w15 w16se w16cid w16 w16cex w16sdtdh w16sdtfl w16du">
   <w:docDefaults>
     <w:rPrDefault>
       <w:rPr>
@@ -12734,6 +13010,7 @@
         <w:numId w:val="2"/>
       </w:numPr>
       <w:spacing w:before="120"/>
+      <w:ind w:left="567"/>
       <w:outlineLvl w:val="1"/>
     </w:pPr>
   </w:style>
@@ -29892,6 +30169,10 @@
 </file>
 
 <file path=customXml/item1.xml><?xml version="1.0" encoding="utf-8"?>
+<b:Sources xmlns:b="http://schemas.openxmlformats.org/officeDocument/2006/bibliography" xmlns="http://schemas.openxmlformats.org/officeDocument/2006/bibliography" SelectedStyle="\APA.XSL" StyleName="APA"/>
+</file>
+
+<file path=customXml/item2.xml><?xml version="1.0" encoding="utf-8"?>
 <?mso-contentType ?>
 <FormTemplates xmlns="http://schemas.microsoft.com/sharepoint/v3/contenttype/forms">
   <Display>DocumentLibraryForm</Display>
@@ -29900,13 +30181,21 @@
 </FormTemplates>
 </file>
 
-<file path=customXml/item2.xml><?xml version="1.0" encoding="utf-8"?>
-<b:Sources xmlns:b="http://schemas.openxmlformats.org/officeDocument/2006/bibliography" xmlns="http://schemas.openxmlformats.org/officeDocument/2006/bibliography" SelectedStyle="\APA.XSL" StyleName="APA"/>
+<file path=customXml/item3.xml><?xml version="1.0" encoding="utf-8"?>
+<p:properties xmlns:p="http://schemas.microsoft.com/office/2006/metadata/properties" xmlns:xsi="http://www.w3.org/2001/XMLSchema-instance" xmlns:pc="http://schemas.microsoft.com/office/infopath/2007/PartnerControls">
+  <documentManagement>
+    <lcf76f155ced4ddcb4097134ff3c332f xmlns="0c1da322-12d3-4b54-965b-93f85e07568a">
+      <Terms xmlns="http://schemas.microsoft.com/office/infopath/2007/PartnerControls"/>
+    </lcf76f155ced4ddcb4097134ff3c332f>
+    <TaxCatchAll xmlns="2f31a1f2-3b7c-4111-a918-260d967bced9" xsi:nil="true"/>
+    <_Flow_SignoffStatus xmlns="0c1da322-12d3-4b54-965b-93f85e07568a" xsi:nil="true"/>
+  </documentManagement>
+</p:properties>
 </file>
 
-<file path=customXml/item3.xml><?xml version="1.0" encoding="utf-8"?>
-<ct:contentTypeSchema xmlns:ct="http://schemas.microsoft.com/office/2006/metadata/contentType" xmlns:ma="http://schemas.microsoft.com/office/2006/metadata/properties/metaAttributes" ct:_="" ma:_="" ma:contentTypeName="ドキュメント" ma:contentTypeID="0x010100E74015F89DCDC9458ECE074A16CABC47" ma:contentTypeVersion="20" ma:contentTypeDescription="新しいドキュメントを作成します。" ma:contentTypeScope="" ma:versionID="3d08fe91a017704c80d8e2958db46b44">
-  <xsd:schema xmlns:xsd="http://www.w3.org/2001/XMLSchema" xmlns:xs="http://www.w3.org/2001/XMLSchema" xmlns:p="http://schemas.microsoft.com/office/2006/metadata/properties" xmlns:ns2="2f31a1f2-3b7c-4111-a918-260d967bced9" xmlns:ns3="0c1da322-12d3-4b54-965b-93f85e07568a" targetNamespace="http://schemas.microsoft.com/office/2006/metadata/properties" ma:root="true" ma:fieldsID="bbdd8c94c51faa50d633b19879b2e92c" ns2:_="" ns3:_="">
+<file path=customXml/item4.xml><?xml version="1.0" encoding="utf-8"?>
+<ct:contentTypeSchema xmlns:ct="http://schemas.microsoft.com/office/2006/metadata/contentType" xmlns:ma="http://schemas.microsoft.com/office/2006/metadata/properties/metaAttributes" ct:_="" ma:_="" ma:contentTypeName="ドキュメント" ma:contentTypeID="0x010100E74015F89DCDC9458ECE074A16CABC47" ma:contentTypeVersion="22" ma:contentTypeDescription="新しいドキュメントを作成します。" ma:contentTypeScope="" ma:versionID="3eef093fb1a52aa59e33f48938b45d20">
+  <xsd:schema xmlns:xsd="http://www.w3.org/2001/XMLSchema" xmlns:xs="http://www.w3.org/2001/XMLSchema" xmlns:p="http://schemas.microsoft.com/office/2006/metadata/properties" xmlns:ns2="2f31a1f2-3b7c-4111-a918-260d967bced9" xmlns:ns3="0c1da322-12d3-4b54-965b-93f85e07568a" targetNamespace="http://schemas.microsoft.com/office/2006/metadata/properties" ma:root="true" ma:fieldsID="4eb6c3a40c4f0aae59a0da10d8b6169a" ns2:_="" ns3:_="">
     <xsd:import namespace="2f31a1f2-3b7c-4111-a918-260d967bced9"/>
     <xsd:import namespace="0c1da322-12d3-4b54-965b-93f85e07568a"/>
     <xsd:element name="properties">
@@ -29930,6 +30219,8 @@
                 <xsd:element ref="ns3:MediaServiceDateTaken" minOccurs="0"/>
                 <xsd:element ref="ns2:TaxCatchAll" minOccurs="0"/>
                 <xsd:element ref="ns3:lcf76f155ced4ddcb4097134ff3c332f" minOccurs="0"/>
+                <xsd:element ref="ns3:MediaServiceObjectDetectorVersions" minOccurs="0"/>
+                <xsd:element ref="ns3:MediaServiceSearchProperties" minOccurs="0"/>
               </xsd:all>
             </xsd:complexType>
           </xsd:element>
@@ -30047,6 +30338,16 @@
         </xsd:sequence>
       </xsd:complexType>
     </xsd:element>
+    <xsd:element name="MediaServiceObjectDetectorVersions" ma:index="24" nillable="true" ma:displayName="MediaServiceObjectDetectorVersions" ma:hidden="true" ma:indexed="true" ma:internalName="MediaServiceObjectDetectorVersions" ma:readOnly="true">
+      <xsd:simpleType>
+        <xsd:restriction base="dms:Text"/>
+      </xsd:simpleType>
+    </xsd:element>
+    <xsd:element name="MediaServiceSearchProperties" ma:index="25" nillable="true" ma:displayName="MediaServiceSearchProperties" ma:hidden="true" ma:internalName="MediaServiceSearchProperties" ma:readOnly="true">
+      <xsd:simpleType>
+        <xsd:restriction base="dms:Note"/>
+      </xsd:simpleType>
+    </xsd:element>
   </xsd:schema>
   <xsd:schema xmlns="http://schemas.openxmlformats.org/package/2006/metadata/core-properties" xmlns:xsd="http://www.w3.org/2001/XMLSchema" xmlns:xsi="http://www.w3.org/2001/XMLSchema-instance" xmlns:dc="http://purl.org/dc/elements/1.1/" xmlns:dcterms="http://purl.org/dc/terms/" xmlns:odoc="http://schemas.microsoft.com/internal/obd" targetNamespace="http://schemas.openxmlformats.org/package/2006/metadata/core-properties" elementFormDefault="qualified" attributeFormDefault="unqualified" blockDefault="#all">
     <xsd:import namespace="http://purl.org/dc/elements/1.1/" schemaLocation="http://dublincore.org/schemas/xmls/qdc/2003/04/02/dc.xsd"/>
@@ -30147,19 +30448,15 @@
 </ct:contentTypeSchema>
 </file>
 
-<file path=customXml/item4.xml><?xml version="1.0" encoding="utf-8"?>
-<p:properties xmlns:p="http://schemas.microsoft.com/office/2006/metadata/properties" xmlns:xsi="http://www.w3.org/2001/XMLSchema-instance" xmlns:pc="http://schemas.microsoft.com/office/infopath/2007/PartnerControls">
-  <documentManagement>
-    <lcf76f155ced4ddcb4097134ff3c332f xmlns="0c1da322-12d3-4b54-965b-93f85e07568a">
-      <Terms xmlns="http://schemas.microsoft.com/office/infopath/2007/PartnerControls"/>
-    </lcf76f155ced4ddcb4097134ff3c332f>
-    <TaxCatchAll xmlns="2f31a1f2-3b7c-4111-a918-260d967bced9" xsi:nil="true"/>
-    <_Flow_SignoffStatus xmlns="0c1da322-12d3-4b54-965b-93f85e07568a" xsi:nil="true"/>
-  </documentManagement>
-</p:properties>
+<file path=customXml/itemProps1.xml><?xml version="1.0" encoding="utf-8"?>
+<ds:datastoreItem xmlns:ds="http://schemas.openxmlformats.org/officeDocument/2006/customXml" ds:itemID="{D9E1E532-94A0-40F1-BB0D-C905594FCE10}">
+  <ds:schemaRefs>
+    <ds:schemaRef ds:uri="http://schemas.openxmlformats.org/officeDocument/2006/bibliography"/>
+  </ds:schemaRefs>
+</ds:datastoreItem>
 </file>
 
-<file path=customXml/itemProps1.xml><?xml version="1.0" encoding="utf-8"?>
+<file path=customXml/itemProps2.xml><?xml version="1.0" encoding="utf-8"?>
 <ds:datastoreItem xmlns:ds="http://schemas.openxmlformats.org/officeDocument/2006/customXml" ds:itemID="{4D46B824-0130-4A0B-92E9-F5C451B99ABB}">
   <ds:schemaRefs>
     <ds:schemaRef ds:uri="http://schemas.microsoft.com/sharepoint/v3/contenttype/forms"/>
@@ -30167,16 +30464,19 @@
 </ds:datastoreItem>
 </file>
 
-<file path=customXml/itemProps2.xml><?xml version="1.0" encoding="utf-8"?>
-<ds:datastoreItem xmlns:ds="http://schemas.openxmlformats.org/officeDocument/2006/customXml" ds:itemID="{D9E1E532-94A0-40F1-BB0D-C905594FCE10}">
+<file path=customXml/itemProps3.xml><?xml version="1.0" encoding="utf-8"?>
+<ds:datastoreItem xmlns:ds="http://schemas.openxmlformats.org/officeDocument/2006/customXml" ds:itemID="{B469B3FD-4855-4FDB-90AC-BC72384B66F2}">
   <ds:schemaRefs>
-    <ds:schemaRef ds:uri="http://schemas.openxmlformats.org/officeDocument/2006/bibliography"/>
+    <ds:schemaRef ds:uri="http://schemas.microsoft.com/office/2006/metadata/properties"/>
+    <ds:schemaRef ds:uri="http://schemas.microsoft.com/office/infopath/2007/PartnerControls"/>
+    <ds:schemaRef ds:uri="0c1da322-12d3-4b54-965b-93f85e07568a"/>
+    <ds:schemaRef ds:uri="2f31a1f2-3b7c-4111-a918-260d967bced9"/>
   </ds:schemaRefs>
 </ds:datastoreItem>
 </file>
 
-<file path=customXml/itemProps3.xml><?xml version="1.0" encoding="utf-8"?>
-<ds:datastoreItem xmlns:ds="http://schemas.openxmlformats.org/officeDocument/2006/customXml" ds:itemID="{DC9A3136-8DAF-443E-A524-26F8BDCCC654}">
+<file path=customXml/itemProps4.xml><?xml version="1.0" encoding="utf-8"?>
+<ds:datastoreItem xmlns:ds="http://schemas.openxmlformats.org/officeDocument/2006/customXml" ds:itemID="{B7B3ACD7-F988-4BCA-82EE-58E0524A6BCA}">
   <ds:schemaRefs>
     <ds:schemaRef ds:uri="http://schemas.microsoft.com/office/2006/metadata/contentType"/>
     <ds:schemaRef ds:uri="http://schemas.microsoft.com/office/2006/metadata/properties/metaAttributes"/>
@@ -30194,13 +30494,8 @@
 </ds:datastoreItem>
 </file>
 
-<file path=customXml/itemProps4.xml><?xml version="1.0" encoding="utf-8"?>
-<ds:datastoreItem xmlns:ds="http://schemas.openxmlformats.org/officeDocument/2006/customXml" ds:itemID="{B469B3FD-4855-4FDB-90AC-BC72384B66F2}">
-  <ds:schemaRefs>
-    <ds:schemaRef ds:uri="http://schemas.microsoft.com/office/2006/metadata/properties"/>
-    <ds:schemaRef ds:uri="http://schemas.microsoft.com/office/infopath/2007/PartnerControls"/>
-    <ds:schemaRef ds:uri="0c1da322-12d3-4b54-965b-93f85e07568a"/>
-    <ds:schemaRef ds:uri="2f31a1f2-3b7c-4111-a918-260d967bced9"/>
-  </ds:schemaRefs>
-</ds:datastoreItem>
+<file path=docMetadata/LabelInfo.xml><?xml version="1.0" encoding="utf-8"?>
+<clbl:labelList xmlns:clbl="http://schemas.microsoft.com/office/2020/mipLabelMetadata">
+  <clbl:label id="{a7295cc1-d279-42ac-ab4d-3b0f4fece050}" enabled="1" method="Standard" siteId="{a19f121d-81e1-4858-a9d8-736e267fd4c7}" removed="0"/>
+</clbl:labelList>
 </file>
</xml_diff>